<commit_message>
Update project and cv
</commit_message>
<xml_diff>
--- a/public/assets/cv/cv.docx
+++ b/public/assets/cv/cv.docx
@@ -1,6 +1,6 @@
 
 <file path=word/document.xml><?xml version="1.0" encoding="utf-8"?>
-<w:document xmlns:wpc="http://schemas.microsoft.com/office/word/2010/wordprocessingCanvas" xmlns:cx="http://schemas.microsoft.com/office/drawing/2014/chartex" xmlns:cx1="http://schemas.microsoft.com/office/drawing/2015/9/8/chartex" xmlns:cx2="http://schemas.microsoft.com/office/drawing/2015/10/21/chartex" xmlns:cx3="http://schemas.microsoft.com/office/drawing/2016/5/9/chartex" xmlns:cx4="http://schemas.microsoft.com/office/drawing/2016/5/10/chartex" xmlns:cx5="http://schemas.microsoft.com/office/drawing/2016/5/11/chartex" xmlns:cx6="http://schemas.microsoft.com/office/drawing/2016/5/12/chartex" xmlns:cx7="http://schemas.microsoft.com/office/drawing/2016/5/13/chartex" xmlns:cx8="http://schemas.microsoft.com/office/drawing/2016/5/14/chartex" xmlns:mc="http://schemas.openxmlformats.org/markup-compatibility/2006" xmlns:aink="http://schemas.microsoft.com/office/drawing/2016/ink" xmlns:am3d="http://schemas.microsoft.com/office/drawing/2017/model3d" xmlns:o="urn:schemas-microsoft-com:office:office" xmlns:oel="http://schemas.microsoft.com/office/2019/extlst" xmlns:r="http://schemas.openxmlformats.org/officeDocument/2006/relationships" xmlns:m="http://schemas.openxmlformats.org/officeDocument/2006/math" xmlns:v="urn:schemas-microsoft-com:vml" xmlns:wp14="http://schemas.microsoft.com/office/word/2010/wordprocessingDrawing" xmlns:wp="http://schemas.openxmlformats.org/drawingml/2006/wordprocessingDrawing" xmlns:w10="urn:schemas-microsoft-com:office:word" xmlns:w="http://schemas.openxmlformats.org/wordprocessingml/2006/main" xmlns:w14="http://schemas.microsoft.com/office/word/2010/wordml" xmlns:w15="http://schemas.microsoft.com/office/word/2012/wordml" xmlns:w16cex="http://schemas.microsoft.com/office/word/2018/wordml/cex" xmlns:w16cid="http://schemas.microsoft.com/office/word/2016/wordml/cid" xmlns:w16="http://schemas.microsoft.com/office/word/2018/wordml" xmlns:w16du="http://schemas.microsoft.com/office/word/2023/wordml/word16du" xmlns:w16sdtdh="http://schemas.microsoft.com/office/word/2020/wordml/sdtdatahash" xmlns:w16se="http://schemas.microsoft.com/office/word/2015/wordml/symex" xmlns:wpg="http://schemas.microsoft.com/office/word/2010/wordprocessingGroup" xmlns:wpi="http://schemas.microsoft.com/office/word/2010/wordprocessingInk" xmlns:wne="http://schemas.microsoft.com/office/word/2006/wordml" xmlns:wps="http://schemas.microsoft.com/office/word/2010/wordprocessingShape" mc:Ignorable="w14 w15 w16se w16cid w16 w16cex w16sdtdh w16du wp14">
+<w:document xmlns:wpc="http://schemas.microsoft.com/office/word/2010/wordprocessingCanvas" xmlns:cx="http://schemas.microsoft.com/office/drawing/2014/chartex" xmlns:cx1="http://schemas.microsoft.com/office/drawing/2015/9/8/chartex" xmlns:cx2="http://schemas.microsoft.com/office/drawing/2015/10/21/chartex" xmlns:cx3="http://schemas.microsoft.com/office/drawing/2016/5/9/chartex" xmlns:cx4="http://schemas.microsoft.com/office/drawing/2016/5/10/chartex" xmlns:cx5="http://schemas.microsoft.com/office/drawing/2016/5/11/chartex" xmlns:cx6="http://schemas.microsoft.com/office/drawing/2016/5/12/chartex" xmlns:cx7="http://schemas.microsoft.com/office/drawing/2016/5/13/chartex" xmlns:cx8="http://schemas.microsoft.com/office/drawing/2016/5/14/chartex" xmlns:mc="http://schemas.openxmlformats.org/markup-compatibility/2006" xmlns:aink="http://schemas.microsoft.com/office/drawing/2016/ink" xmlns:am3d="http://schemas.microsoft.com/office/drawing/2017/model3d" xmlns:o="urn:schemas-microsoft-com:office:office" xmlns:oel="http://schemas.microsoft.com/office/2019/extlst" xmlns:r="http://schemas.openxmlformats.org/officeDocument/2006/relationships" xmlns:m="http://schemas.openxmlformats.org/officeDocument/2006/math" xmlns:v="urn:schemas-microsoft-com:vml" xmlns:wp14="http://schemas.microsoft.com/office/word/2010/wordprocessingDrawing" xmlns:wp="http://schemas.openxmlformats.org/drawingml/2006/wordprocessingDrawing" xmlns:w10="urn:schemas-microsoft-com:office:word" xmlns:w="http://schemas.openxmlformats.org/wordprocessingml/2006/main" xmlns:w14="http://schemas.microsoft.com/office/word/2010/wordml" xmlns:w15="http://schemas.microsoft.com/office/word/2012/wordml" xmlns:w16cex="http://schemas.microsoft.com/office/word/2018/wordml/cex" xmlns:w16cid="http://schemas.microsoft.com/office/word/2016/wordml/cid" xmlns:w16="http://schemas.microsoft.com/office/word/2018/wordml" xmlns:w16du="http://schemas.microsoft.com/office/word/2023/wordml/word16du" xmlns:w16sdtdh="http://schemas.microsoft.com/office/word/2020/wordml/sdtdatahash" xmlns:w16sdtfl="http://schemas.microsoft.com/office/word/2024/wordml/sdtformatlock" xmlns:w16se="http://schemas.microsoft.com/office/word/2015/wordml/symex" xmlns:wpg="http://schemas.microsoft.com/office/word/2010/wordprocessingGroup" xmlns:wpi="http://schemas.microsoft.com/office/word/2010/wordprocessingInk" xmlns:wne="http://schemas.microsoft.com/office/word/2006/wordml" xmlns:wps="http://schemas.microsoft.com/office/word/2010/wordprocessingShape" mc:Ignorable="w14 w15 w16se w16cid w16 w16cex w16sdtdh w16sdtfl w16du wp14">
   <w:body>
     <w:p>
       <w:pPr>
@@ -71,20 +71,18 @@
               </wp:anchor>
             </w:drawing>
           </mc:Choice>
-          <mc:Fallback xmlns:ve="http://schemas.openxmlformats.org/markup-compatibility/2006" xmlns:a="http://schemas.openxmlformats.org/drawingml/2006/main" xmlns:pic="http://schemas.openxmlformats.org/drawingml/2006/picture">
+          <mc:Fallback>
             <w:pict>
-              <v:shapetype id="_x0000_t202" o:spt="202" coordsize="21600,21600" path="m,l,21600r21600,l21600,xe">
+              <v:shapetype id="_x0000_t202" coordsize="21600,21600" o:spt="202" path="m,l,21600r21600,l21600,xe">
                 <v:stroke joinstyle="miter"/>
                 <v:path gradientshapeok="t" o:connecttype="rect"/>
               </v:shapetype>
-              <v:shape style="position:absolute;margin-left:72pt;margin-top:20.946640pt;width:6pt;height:13.3pt;mso-position-horizontal-relative:page;mso-position-vertical-relative:paragraph;z-index:-15803904" type="#_x0000_t202" id="docshape1" filled="false" stroked="false">
+              <v:shape id="Textbox 1" o:spid="_x0000_s1026" type="#_x0000_t202" style="position:absolute;left:0;text-align:left;margin-left:1in;margin-top:20.95pt;width:6pt;height:13.3pt;z-index:-15803904;visibility:visible;mso-wrap-style:square;mso-wrap-distance-left:0;mso-wrap-distance-top:0;mso-wrap-distance-right:0;mso-wrap-distance-bottom:0;mso-position-horizontal:absolute;mso-position-horizontal-relative:page;mso-position-vertical:absolute;mso-position-vertical-relative:text;v-text-anchor:top" o:gfxdata="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" filled="f" stroked="f">
                 <v:textbox inset="0,0,0,0">
                   <w:txbxContent>
                     <w:p>
                       <w:pPr>
-                        <w:spacing w:line="266" w:lineRule="exact" w:before="0"/>
-                        <w:ind w:left="0" w:right="0" w:firstLine="0"/>
-                        <w:jc w:val="left"/>
+                        <w:spacing w:line="266" w:lineRule="exact"/>
                         <w:rPr>
                           <w:sz w:val="24"/>
                         </w:rPr>
@@ -99,7 +97,7 @@
                     </w:p>
                   </w:txbxContent>
                 </v:textbox>
-                <w10:wrap type="none"/>
+                <w10:wrap anchorx="page"/>
               </v:shape>
             </w:pict>
           </mc:Fallback>
@@ -162,7 +160,7 @@
     </w:p>
     <w:p>
       <w:pPr>
-        <w:spacing w:before="174"/>
+        <w:spacing w:line="360" w:lineRule="auto"/>
         <w:ind w:right="589"/>
         <w:jc w:val="right"/>
         <w:rPr>
@@ -172,69 +170,14 @@
       </w:pPr>
       <w:r>
         <w:rPr>
+          <w:position w:val="1"/>
           <w:sz w:val="16"/>
         </w:rPr>
-        <w:t xml:space="preserve">Jl. Bukit Marwah, </w:t>
-      </w:r>
-      <w:proofErr w:type="spellStart"/>
-      <w:r>
-        <w:rPr>
-          <w:sz w:val="16"/>
-        </w:rPr>
-        <w:t>Talise</w:t>
-      </w:r>
-      <w:proofErr w:type="spellEnd"/>
-      <w:r>
-        <w:rPr>
-          <w:sz w:val="16"/>
-        </w:rPr>
-        <w:t xml:space="preserve">, </w:t>
-      </w:r>
-      <w:proofErr w:type="spellStart"/>
-      <w:r>
-        <w:rPr>
-          <w:sz w:val="16"/>
-        </w:rPr>
-        <w:t>Kec</w:t>
-      </w:r>
-      <w:proofErr w:type="spellEnd"/>
-      <w:r>
-        <w:rPr>
-          <w:sz w:val="16"/>
-        </w:rPr>
-        <w:t xml:space="preserve">. </w:t>
-      </w:r>
-      <w:proofErr w:type="spellStart"/>
-      <w:r>
-        <w:rPr>
-          <w:sz w:val="16"/>
-        </w:rPr>
-        <w:t>Mantikulore</w:t>
-      </w:r>
-      <w:proofErr w:type="spellEnd"/>
-      <w:r>
-        <w:rPr>
-          <w:sz w:val="16"/>
-        </w:rPr>
-        <w:t xml:space="preserve">, Kota </w:t>
-      </w:r>
-      <w:proofErr w:type="spellStart"/>
-      <w:r>
-        <w:rPr>
-          <w:sz w:val="16"/>
-        </w:rPr>
-        <w:t>Palu</w:t>
-      </w:r>
-      <w:proofErr w:type="spellEnd"/>
-      <w:r>
-        <w:rPr>
-          <w:sz w:val="16"/>
-        </w:rPr>
-        <w:t>, Sulawesi Tengah, Indonesia</w:t>
-      </w:r>
-      <w:r>
-        <w:rPr>
-          <w:spacing w:val="80"/>
+        <w:t>Palu, Central Sulawesi, Indonesia</w:t>
+      </w:r>
+      <w:r>
+        <w:rPr>
+          <w:position w:val="1"/>
           <w:sz w:val="16"/>
         </w:rPr>
         <w:t xml:space="preserve"> </w:t>
@@ -248,7 +191,7 @@
         </w:rPr>
         <w:drawing>
           <wp:inline distT="0" distB="0" distL="0" distR="0">
-            <wp:extent cx="118744" cy="118703"/>
+            <wp:extent cx="153670" cy="140929"/>
             <wp:effectExtent l="0" t="0" r="0" b="0"/>
             <wp:docPr id="3" name="Image 3"/>
             <wp:cNvGraphicFramePr>
@@ -270,7 +213,7 @@
                   <pic:spPr>
                     <a:xfrm>
                       <a:off x="0" y="0"/>
-                      <a:ext cx="118744" cy="118703"/>
+                      <a:ext cx="161160" cy="147798"/>
                     </a:xfrm>
                     <a:prstGeom prst="rect">
                       <a:avLst/>
@@ -285,8 +228,8 @@
     </w:p>
     <w:p>
       <w:pPr>
-        <w:spacing w:before="153"/>
-        <w:ind w:right="596"/>
+        <w:spacing w:line="360" w:lineRule="auto"/>
+        <w:ind w:right="582"/>
         <w:jc w:val="right"/>
         <w:rPr>
           <w:sz w:val="16"/>
@@ -313,8 +256,8 @@
         </w:rPr>
         <w:drawing>
           <wp:inline distT="0" distB="0" distL="0" distR="0">
-            <wp:extent cx="109811" cy="109813"/>
-            <wp:effectExtent l="0" t="0" r="0" b="0"/>
+            <wp:extent cx="136110" cy="118110"/>
+            <wp:effectExtent l="0" t="0" r="3810" b="0"/>
             <wp:docPr id="4" name="Image 4"/>
             <wp:cNvGraphicFramePr>
               <a:graphicFrameLocks xmlns:a="http://schemas.openxmlformats.org/drawingml/2006/main"/>
@@ -335,7 +278,7 @@
                   <pic:spPr>
                     <a:xfrm>
                       <a:off x="0" y="0"/>
-                      <a:ext cx="109811" cy="109813"/>
+                      <a:ext cx="151435" cy="131408"/>
                     </a:xfrm>
                     <a:prstGeom prst="rect">
                       <a:avLst/>
@@ -350,33 +293,117 @@
     </w:p>
     <w:p>
       <w:pPr>
-        <w:pStyle w:val="TeksIsi"/>
-        <w:spacing w:before="1"/>
-        <w:ind w:left="0" w:firstLine="0"/>
+        <w:spacing w:line="360" w:lineRule="auto"/>
+        <w:ind w:left="6649" w:firstLine="737"/>
+      </w:pPr>
+      <w:r>
         <w:rPr>
           <w:sz w:val="16"/>
         </w:rPr>
-      </w:pPr>
-    </w:p>
-    <w:p>
-      <w:pPr>
-        <w:spacing w:line="350" w:lineRule="auto"/>
-        <w:ind w:left="6649" w:firstLine="737"/>
-        <w:rPr>
-          <w:position w:val="1"/>
+        <w:t>uusaamaa0901@gmail.com</w:t>
+      </w:r>
+      <w:r>
+        <w:rPr>
+          <w:spacing w:val="44"/>
           <w:sz w:val="16"/>
         </w:rPr>
-      </w:pPr>
-      <w:hyperlink r:id="rId8">
+        <w:t xml:space="preserve"> </w:t>
+      </w:r>
+      <w:r>
+        <w:rPr>
+          <w:noProof/>
+          <w:spacing w:val="5"/>
+          <w:sz w:val="16"/>
+        </w:rPr>
+        <w:drawing>
+          <wp:inline distT="0" distB="0" distL="0" distR="0">
+            <wp:extent cx="137159" cy="91440"/>
+            <wp:effectExtent l="0" t="0" r="0" b="0"/>
+            <wp:docPr id="5" name="Image 5"/>
+            <wp:cNvGraphicFramePr>
+              <a:graphicFrameLocks xmlns:a="http://schemas.openxmlformats.org/drawingml/2006/main"/>
+            </wp:cNvGraphicFramePr>
+            <a:graphic xmlns:a="http://schemas.openxmlformats.org/drawingml/2006/main">
+              <a:graphicData uri="http://schemas.openxmlformats.org/drawingml/2006/picture">
+                <pic:pic xmlns:pic="http://schemas.openxmlformats.org/drawingml/2006/picture">
+                  <pic:nvPicPr>
+                    <pic:cNvPr id="5" name="Image 5"/>
+                    <pic:cNvPicPr/>
+                  </pic:nvPicPr>
+                  <pic:blipFill>
+                    <a:blip r:embed="rId8" cstate="print"/>
+                    <a:stretch>
+                      <a:fillRect/>
+                    </a:stretch>
+                  </pic:blipFill>
+                  <pic:spPr>
+                    <a:xfrm>
+                      <a:off x="0" y="0"/>
+                      <a:ext cx="137159" cy="91440"/>
+                    </a:xfrm>
+                    <a:prstGeom prst="rect">
+                      <a:avLst/>
+                    </a:prstGeom>
+                  </pic:spPr>
+                </pic:pic>
+              </a:graphicData>
+            </a:graphic>
+          </wp:inline>
+        </w:drawing>
+      </w:r>
+      <w:r>
+        <w:rPr>
+          <w:spacing w:val="5"/>
+          <w:sz w:val="16"/>
+        </w:rPr>
+        <w:t xml:space="preserve"> </w:t>
+      </w:r>
+      <w:r>
+        <w:rPr>
+          <w:sz w:val="16"/>
+        </w:rPr>
+        <w:t>h</w:t>
+      </w:r>
+      <w:r>
+        <w:rPr>
+          <w:sz w:val="16"/>
+        </w:rPr>
+        <w:t>ttps://</w:t>
+      </w:r>
+      <w:hyperlink r:id="rId9">
         <w:r>
           <w:rPr>
             <w:sz w:val="16"/>
           </w:rPr>
-          <w:t>uusaamaa0901@gmail.com</w:t>
+          <w:t>www.lin</w:t>
         </w:r>
         <w:r>
           <w:rPr>
-            <w:spacing w:val="44"/>
+            <w:sz w:val="16"/>
+          </w:rPr>
+          <w:t>k</w:t>
+        </w:r>
+        <w:r>
+          <w:rPr>
+            <w:sz w:val="16"/>
+          </w:rPr>
+          <w:t>e</w:t>
+        </w:r>
+        <w:r>
+          <w:rPr>
+            <w:sz w:val="16"/>
+          </w:rPr>
+          <w:t>d</w:t>
+        </w:r>
+        <w:r>
+          <w:rPr>
+            <w:sz w:val="16"/>
+          </w:rPr>
+          <w:t>in.com/in/uusaamaa</w:t>
+        </w:r>
+        <w:r>
+          <w:rPr>
+            <w:spacing w:val="80"/>
             <w:sz w:val="16"/>
           </w:rPr>
           <w:t xml:space="preserve"> </w:t>
@@ -384,14 +411,15 @@
         <w:r>
           <w:rPr>
             <w:noProof/>
-            <w:spacing w:val="5"/>
+            <w:spacing w:val="-15"/>
+            <w:position w:val="1"/>
             <w:sz w:val="16"/>
           </w:rPr>
           <w:drawing>
             <wp:inline distT="0" distB="0" distL="0" distR="0">
-              <wp:extent cx="137159" cy="91440"/>
+              <wp:extent cx="109843" cy="109687"/>
               <wp:effectExtent l="0" t="0" r="0" b="0"/>
-              <wp:docPr id="5" name="Image 5"/>
+              <wp:docPr id="6" name="Image 6"/>
               <wp:cNvGraphicFramePr>
                 <a:graphicFrameLocks xmlns:a="http://schemas.openxmlformats.org/drawingml/2006/main"/>
               </wp:cNvGraphicFramePr>
@@ -399,11 +427,11 @@
                 <a:graphicData uri="http://schemas.openxmlformats.org/drawingml/2006/picture">
                   <pic:pic xmlns:pic="http://schemas.openxmlformats.org/drawingml/2006/picture">
                     <pic:nvPicPr>
-                      <pic:cNvPr id="5" name="Image 5"/>
+                      <pic:cNvPr id="6" name="Image 6"/>
                       <pic:cNvPicPr/>
                     </pic:nvPicPr>
                     <pic:blipFill>
-                      <a:blip r:embed="rId9" cstate="print"/>
+                      <a:blip r:embed="rId10" cstate="print"/>
                       <a:stretch>
                         <a:fillRect/>
                       </a:stretch>
@@ -411,7 +439,7 @@
                     <pic:spPr>
                       <a:xfrm>
                         <a:off x="0" y="0"/>
-                        <a:ext cx="137159" cy="91440"/>
+                        <a:ext cx="109843" cy="109687"/>
                       </a:xfrm>
                       <a:prstGeom prst="rect">
                         <a:avLst/>
@@ -423,78 +451,144 @@
             </wp:inline>
           </w:drawing>
         </w:r>
-        <w:r>
-          <w:rPr>
-            <w:spacing w:val="5"/>
-            <w:sz w:val="16"/>
-          </w:rPr>
-          <w:t xml:space="preserve"> </w:t>
-        </w:r>
-        <w:r>
-          <w:rPr>
-            <w:sz w:val="16"/>
-          </w:rPr>
-          <w:t>https://</w:t>
-        </w:r>
-        <w:hyperlink r:id="rId10">
-          <w:r>
-            <w:rPr>
-              <w:sz w:val="16"/>
-            </w:rPr>
-            <w:t>www.linkedin.com/in/uusaamaa</w:t>
-          </w:r>
-          <w:r>
-            <w:rPr>
-              <w:spacing w:val="80"/>
-              <w:sz w:val="16"/>
-            </w:rPr>
-            <w:t xml:space="preserve"> </w:t>
-          </w:r>
-          <w:r>
-            <w:rPr>
-              <w:noProof/>
-              <w:spacing w:val="-15"/>
-              <w:position w:val="1"/>
-              <w:sz w:val="16"/>
-            </w:rPr>
-            <w:drawing>
-              <wp:inline distT="0" distB="0" distL="0" distR="0">
-                <wp:extent cx="109843" cy="109687"/>
-                <wp:effectExtent l="0" t="0" r="0" b="0"/>
-                <wp:docPr id="6" name="Image 6"/>
-                <wp:cNvGraphicFramePr>
-                  <a:graphicFrameLocks xmlns:a="http://schemas.openxmlformats.org/drawingml/2006/main"/>
-                </wp:cNvGraphicFramePr>
-                <a:graphic xmlns:a="http://schemas.openxmlformats.org/drawingml/2006/main">
-                  <a:graphicData uri="http://schemas.openxmlformats.org/drawingml/2006/picture">
-                    <pic:pic xmlns:pic="http://schemas.openxmlformats.org/drawingml/2006/picture">
-                      <pic:nvPicPr>
-                        <pic:cNvPr id="6" name="Image 6"/>
-                        <pic:cNvPicPr/>
-                      </pic:nvPicPr>
-                      <pic:blipFill>
-                        <a:blip r:embed="rId11" cstate="print"/>
-                        <a:stretch>
-                          <a:fillRect/>
-                        </a:stretch>
-                      </pic:blipFill>
-                      <pic:spPr>
-                        <a:xfrm>
-                          <a:off x="0" y="0"/>
-                          <a:ext cx="109843" cy="109687"/>
-                        </a:xfrm>
-                        <a:prstGeom prst="rect">
-                          <a:avLst/>
-                        </a:prstGeom>
-                      </pic:spPr>
-                    </pic:pic>
-                  </a:graphicData>
-                </a:graphic>
-              </wp:inline>
-            </w:drawing>
-          </w:r>
-        </w:hyperlink>
       </w:hyperlink>
+    </w:p>
+    <w:p>
+      <w:pPr>
+        <w:spacing w:line="360" w:lineRule="auto"/>
+        <w:ind w:left="6649" w:right="582" w:hanging="128"/>
+        <w:jc w:val="right"/>
+        <w:rPr>
+          <w:color w:val="000000" w:themeColor="text1"/>
+          <w:sz w:val="16"/>
+          <w:szCs w:val="16"/>
+        </w:rPr>
+      </w:pPr>
+      <w:r>
+        <w:rPr>
+          <w:color w:val="000000" w:themeColor="text1"/>
+          <w:sz w:val="16"/>
+          <w:szCs w:val="16"/>
+        </w:rPr>
+        <w:fldChar w:fldCharType="begin"/>
+      </w:r>
+      <w:r>
+        <w:rPr>
+          <w:color w:val="000000" w:themeColor="text1"/>
+          <w:sz w:val="16"/>
+          <w:szCs w:val="16"/>
+        </w:rPr>
+        <w:instrText>HYPERLINK "</w:instrText>
+      </w:r>
+      <w:r>
+        <w:rPr>
+          <w:color w:val="000000" w:themeColor="text1"/>
+          <w:sz w:val="16"/>
+          <w:szCs w:val="16"/>
+        </w:rPr>
+        <w:instrText>https://usama-portofolio.vercel.app/</w:instrText>
+      </w:r>
+      <w:r>
+        <w:rPr>
+          <w:color w:val="000000" w:themeColor="text1"/>
+          <w:sz w:val="16"/>
+          <w:szCs w:val="16"/>
+        </w:rPr>
+        <w:instrText>"</w:instrText>
+      </w:r>
+      <w:r>
+        <w:rPr>
+          <w:color w:val="000000" w:themeColor="text1"/>
+          <w:sz w:val="16"/>
+          <w:szCs w:val="16"/>
+        </w:rPr>
+        <w:fldChar w:fldCharType="separate"/>
+      </w:r>
+      <w:r>
+        <w:rPr>
+          <w:rStyle w:val="Hyperlink"/>
+          <w:color w:val="000000" w:themeColor="text1"/>
+          <w:sz w:val="16"/>
+          <w:szCs w:val="16"/>
+          <w:u w:val="none"/>
+        </w:rPr>
+        <w:t>https://usama-portofolio.vercel.app/</w:t>
+      </w:r>
+      <w:r>
+        <w:rPr>
+          <w:color w:val="000000" w:themeColor="text1"/>
+          <w:sz w:val="16"/>
+          <w:szCs w:val="16"/>
+        </w:rPr>
+        <w:fldChar w:fldCharType="end"/>
+      </w:r>
+      <w:r>
+        <w:rPr>
+          <w:color w:val="000000" w:themeColor="text1"/>
+          <w:sz w:val="16"/>
+          <w:szCs w:val="16"/>
+        </w:rPr>
+        <w:t xml:space="preserve"> </w:t>
+      </w:r>
+      <w:r>
+        <w:rPr>
+          <w:noProof/>
+          <w:color w:val="000000" w:themeColor="text1"/>
+        </w:rPr>
+        <w:drawing>
+          <wp:inline distT="0" distB="0" distL="0" distR="0" wp14:anchorId="3DECCFDC" wp14:editId="40EF01D7">
+            <wp:extent cx="159385" cy="73660"/>
+            <wp:effectExtent l="0" t="0" r="5715" b="2540"/>
+            <wp:docPr id="424497127" name="Gambar 10" descr="Portfolio Logo PNG Transparent &amp; SVG ..."/>
+            <wp:cNvGraphicFramePr>
+              <a:graphicFrameLocks xmlns:a="http://schemas.openxmlformats.org/drawingml/2006/main" noChangeAspect="1"/>
+            </wp:cNvGraphicFramePr>
+            <a:graphic xmlns:a="http://schemas.openxmlformats.org/drawingml/2006/main">
+              <a:graphicData uri="http://schemas.openxmlformats.org/drawingml/2006/picture">
+                <pic:pic xmlns:pic="http://schemas.openxmlformats.org/drawingml/2006/picture">
+                  <pic:nvPicPr>
+                    <pic:cNvPr id="0" name="Picture 1" descr="Portfolio Logo PNG Transparent &amp; SVG ..."/>
+                    <pic:cNvPicPr>
+                      <a:picLocks noChangeAspect="1" noChangeArrowheads="1"/>
+                    </pic:cNvPicPr>
+                  </pic:nvPicPr>
+                  <pic:blipFill rotWithShape="1">
+                    <a:blip r:embed="rId11" cstate="print">
+                      <a:extLst>
+                        <a:ext uri="{28A0092B-C50C-407E-A947-70E740481C1C}">
+                          <a14:useLocalDpi xmlns:a14="http://schemas.microsoft.com/office/drawing/2010/main" val="0"/>
+                        </a:ext>
+                      </a:extLst>
+                    </a:blip>
+                    <a:srcRect l="1" t="25499" r="-4" b="28285"/>
+                    <a:stretch>
+                      <a:fillRect/>
+                    </a:stretch>
+                  </pic:blipFill>
+                  <pic:spPr bwMode="auto">
+                    <a:xfrm>
+                      <a:off x="0" y="0"/>
+                      <a:ext cx="177128" cy="81860"/>
+                    </a:xfrm>
+                    <a:prstGeom prst="rect">
+                      <a:avLst/>
+                    </a:prstGeom>
+                    <a:noFill/>
+                    <a:ln>
+                      <a:noFill/>
+                    </a:ln>
+                    <a:extLst>
+                      <a:ext uri="{53640926-AAD7-44D8-BBD7-CCE9431645EC}">
+                        <a14:shadowObscured xmlns:a14="http://schemas.microsoft.com/office/drawing/2010/main"/>
+                      </a:ext>
+                    </a:extLst>
+                  </pic:spPr>
+                </pic:pic>
+              </a:graphicData>
+            </a:graphic>
+          </wp:inline>
+        </w:drawing>
+      </w:r>
     </w:p>
     <w:p>
       <w:pPr>
@@ -504,7 +598,7 @@
         <w:jc w:val="both"/>
       </w:pPr>
       <w:r>
-        <w:t xml:space="preserve">I am an Informatics Engineering student at </w:t>
+        <w:t xml:space="preserve">Informatics Engineering student at </w:t>
       </w:r>
       <w:proofErr w:type="spellStart"/>
       <w:r>
@@ -512,87 +606,8 @@
       </w:r>
       <w:proofErr w:type="spellEnd"/>
       <w:r>
-        <w:t xml:space="preserve"> University who has a great passion for learning and pursuing a career in the IT world. What I like about this field is the constant challenges—the deeper we learn, the more we realize that there is still a lot to learn. This drives me to continue to grow</w:t>
-      </w:r>
-      <w:r>
-        <w:rPr>
-          <w:spacing w:val="-1"/>
-        </w:rPr>
-        <w:t xml:space="preserve"> </w:t>
-      </w:r>
-      <w:r>
-        <w:t>and adapt to the ever-changing technology.</w:t>
-      </w:r>
-      <w:r>
-        <w:t xml:space="preserve"> </w:t>
-      </w:r>
-      <w:r>
-        <w:t xml:space="preserve">my </w:t>
-      </w:r>
-      <w:proofErr w:type="gramStart"/>
-      <w:r>
-        <w:t>portfolio :</w:t>
-      </w:r>
-      <w:proofErr w:type="gramEnd"/>
-      <w:r>
-        <w:t xml:space="preserve"> </w:t>
-      </w:r>
-      <w:hyperlink r:id="rId12" w:history="1">
-        <w:r>
-          <w:rPr>
-            <w:rStyle w:val="Hyperlink"/>
-          </w:rPr>
-          <w:t>https://usam</w:t>
-        </w:r>
-        <w:r>
-          <w:rPr>
-            <w:rStyle w:val="Hyperlink"/>
-          </w:rPr>
-          <w:t>a</w:t>
-        </w:r>
-        <w:r>
-          <w:rPr>
-            <w:rStyle w:val="Hyperlink"/>
-          </w:rPr>
-          <w:t>-porto</w:t>
-        </w:r>
-        <w:r>
-          <w:rPr>
-            <w:rStyle w:val="Hyperlink"/>
-          </w:rPr>
-          <w:t>f</w:t>
-        </w:r>
-        <w:r>
-          <w:rPr>
-            <w:rStyle w:val="Hyperlink"/>
-          </w:rPr>
-          <w:t>olio.v</w:t>
-        </w:r>
-        <w:r>
-          <w:rPr>
-            <w:rStyle w:val="Hyperlink"/>
-          </w:rPr>
-          <w:t>e</w:t>
-        </w:r>
-        <w:r>
-          <w:rPr>
-            <w:rStyle w:val="Hyperlink"/>
-          </w:rPr>
-          <w:t>r</w:t>
-        </w:r>
-        <w:r>
-          <w:rPr>
-            <w:rStyle w:val="Hyperlink"/>
-          </w:rPr>
-          <w:t>c</w:t>
-        </w:r>
-        <w:r>
-          <w:rPr>
-            <w:rStyle w:val="Hyperlink"/>
-          </w:rPr>
-          <w:t>el.app</w:t>
-        </w:r>
-      </w:hyperlink>
+        <w:t xml:space="preserve"> University with strong interests in Embedded Systems, IoT, and Software Development. Passionate about continuous learning and adapting to emerging technologies. Experienced in both hardware and software development, including AI and web applications.</w:t>
+      </w:r>
     </w:p>
     <w:p>
       <w:pPr>
@@ -718,7 +733,7 @@
         <w:tabs>
           <w:tab w:val="left" w:pos="643"/>
         </w:tabs>
-        <w:spacing w:before="117" w:line="240" w:lineRule="exact"/>
+        <w:spacing w:before="117" w:line="240" w:lineRule="auto"/>
         <w:ind w:left="643" w:hanging="283"/>
         <w:rPr>
           <w:rFonts w:ascii="Calibri" w:hAnsi="Calibri"/>
@@ -795,7 +810,7 @@
         <w:tabs>
           <w:tab w:val="left" w:pos="643"/>
         </w:tabs>
-        <w:spacing w:line="235" w:lineRule="exact"/>
+        <w:spacing w:line="240" w:lineRule="auto"/>
         <w:ind w:left="643" w:hanging="283"/>
         <w:rPr>
           <w:rFonts w:ascii="Calibri" w:hAnsi="Calibri"/>
@@ -872,6 +887,7 @@
         <w:tabs>
           <w:tab w:val="left" w:pos="643"/>
         </w:tabs>
+        <w:spacing w:line="240" w:lineRule="auto"/>
         <w:ind w:left="643" w:hanging="283"/>
         <w:rPr>
           <w:rFonts w:ascii="Calibri" w:hAnsi="Calibri"/>
@@ -909,6 +925,7 @@
         <w:tabs>
           <w:tab w:val="left" w:pos="643"/>
         </w:tabs>
+        <w:spacing w:line="240" w:lineRule="auto"/>
         <w:ind w:left="643" w:hanging="283"/>
         <w:rPr>
           <w:rFonts w:ascii="Calibri" w:hAnsi="Calibri"/>
@@ -946,7 +963,7 @@
         <w:tabs>
           <w:tab w:val="left" w:pos="643"/>
         </w:tabs>
-        <w:spacing w:line="235" w:lineRule="exact"/>
+        <w:spacing w:line="240" w:lineRule="auto"/>
         <w:ind w:left="643" w:hanging="283"/>
         <w:rPr>
           <w:rFonts w:ascii="Calibri" w:hAnsi="Calibri"/>
@@ -1010,6 +1027,7 @@
         <w:tabs>
           <w:tab w:val="left" w:pos="643"/>
         </w:tabs>
+        <w:spacing w:line="240" w:lineRule="auto"/>
         <w:ind w:left="643" w:hanging="283"/>
         <w:rPr>
           <w:rFonts w:ascii="Calibri" w:hAnsi="Calibri"/>
@@ -1047,6 +1065,7 @@
         <w:tabs>
           <w:tab w:val="left" w:pos="643"/>
         </w:tabs>
+        <w:spacing w:line="240" w:lineRule="auto"/>
         <w:ind w:left="643" w:hanging="283"/>
         <w:rPr>
           <w:rFonts w:ascii="Calibri" w:hAnsi="Calibri"/>
@@ -1097,6 +1116,12 @@
           <w:sz w:val="20"/>
         </w:rPr>
         <w:t>JS,</w:t>
+      </w:r>
+      <w:r>
+        <w:rPr>
+          <w:sz w:val="20"/>
+        </w:rPr>
+        <w:t xml:space="preserve"> Next JS,</w:t>
       </w:r>
       <w:r>
         <w:rPr>
@@ -1135,71 +1160,17 @@
         <w:tabs>
           <w:tab w:val="left" w:pos="643"/>
         </w:tabs>
-        <w:spacing w:line="235" w:lineRule="exact"/>
+        <w:spacing w:line="240" w:lineRule="auto"/>
         <w:ind w:left="643" w:hanging="283"/>
         <w:rPr>
-          <w:rFonts w:ascii="Calibri" w:hAnsi="Calibri"/>
-          <w:sz w:val="20"/>
-        </w:rPr>
-      </w:pPr>
-      <w:r>
-        <w:rPr>
-          <w:sz w:val="20"/>
-        </w:rPr>
-        <w:t>Machine</w:t>
-      </w:r>
-      <w:r>
-        <w:rPr>
-          <w:spacing w:val="-6"/>
-          <w:sz w:val="20"/>
-        </w:rPr>
-        <w:t xml:space="preserve"> </w:t>
-      </w:r>
-      <w:r>
-        <w:rPr>
-          <w:sz w:val="20"/>
-        </w:rPr>
-        <w:t>&amp;</w:t>
-      </w:r>
-      <w:r>
-        <w:rPr>
-          <w:spacing w:val="-7"/>
-          <w:sz w:val="20"/>
-        </w:rPr>
-        <w:t xml:space="preserve"> </w:t>
-      </w:r>
-      <w:r>
-        <w:rPr>
-          <w:sz w:val="20"/>
-        </w:rPr>
-        <w:t>Deep</w:t>
-      </w:r>
-      <w:r>
-        <w:rPr>
-          <w:spacing w:val="-6"/>
-          <w:sz w:val="20"/>
-        </w:rPr>
-        <w:t xml:space="preserve"> </w:t>
-      </w:r>
-      <w:r>
-        <w:rPr>
-          <w:sz w:val="20"/>
-        </w:rPr>
-        <w:t>Learning</w:t>
-      </w:r>
-      <w:r>
-        <w:rPr>
-          <w:spacing w:val="-5"/>
-          <w:sz w:val="20"/>
-        </w:rPr>
-        <w:t xml:space="preserve"> </w:t>
-      </w:r>
-      <w:r>
-        <w:rPr>
-          <w:spacing w:val="-2"/>
-          <w:sz w:val="20"/>
-        </w:rPr>
-        <w:t>modeling</w:t>
+          <w:sz w:val="20"/>
+        </w:rPr>
+      </w:pPr>
+      <w:r>
+        <w:rPr>
+          <w:sz w:val="20"/>
+        </w:rPr>
+        <w:t>TypeScript</w:t>
       </w:r>
     </w:p>
     <w:p>
@@ -1212,7 +1183,84 @@
         <w:tabs>
           <w:tab w:val="left" w:pos="643"/>
         </w:tabs>
-        <w:spacing w:line="289" w:lineRule="exact"/>
+        <w:spacing w:line="240" w:lineRule="auto"/>
+        <w:ind w:left="643" w:hanging="283"/>
+        <w:rPr>
+          <w:rFonts w:ascii="Calibri" w:hAnsi="Calibri"/>
+          <w:sz w:val="20"/>
+        </w:rPr>
+      </w:pPr>
+      <w:r>
+        <w:rPr>
+          <w:sz w:val="20"/>
+        </w:rPr>
+        <w:t>AI, Machine</w:t>
+      </w:r>
+      <w:r>
+        <w:rPr>
+          <w:spacing w:val="-6"/>
+          <w:sz w:val="20"/>
+        </w:rPr>
+        <w:t xml:space="preserve"> </w:t>
+      </w:r>
+      <w:r>
+        <w:rPr>
+          <w:sz w:val="20"/>
+        </w:rPr>
+        <w:t>&amp;</w:t>
+      </w:r>
+      <w:r>
+        <w:rPr>
+          <w:spacing w:val="-7"/>
+          <w:sz w:val="20"/>
+        </w:rPr>
+        <w:t xml:space="preserve"> </w:t>
+      </w:r>
+      <w:r>
+        <w:rPr>
+          <w:sz w:val="20"/>
+        </w:rPr>
+        <w:t>Deep</w:t>
+      </w:r>
+      <w:r>
+        <w:rPr>
+          <w:spacing w:val="-6"/>
+          <w:sz w:val="20"/>
+        </w:rPr>
+        <w:t xml:space="preserve"> </w:t>
+      </w:r>
+      <w:r>
+        <w:rPr>
+          <w:sz w:val="20"/>
+        </w:rPr>
+        <w:t>Learning</w:t>
+      </w:r>
+      <w:r>
+        <w:rPr>
+          <w:spacing w:val="-5"/>
+          <w:sz w:val="20"/>
+        </w:rPr>
+        <w:t xml:space="preserve"> </w:t>
+      </w:r>
+      <w:r>
+        <w:rPr>
+          <w:spacing w:val="-2"/>
+          <w:sz w:val="20"/>
+        </w:rPr>
+        <w:t>modeling</w:t>
+      </w:r>
+    </w:p>
+    <w:p>
+      <w:pPr>
+        <w:pStyle w:val="DaftarParagraf"/>
+        <w:numPr>
+          <w:ilvl w:val="0"/>
+          <w:numId w:val="1"/>
+        </w:numPr>
+        <w:tabs>
+          <w:tab w:val="left" w:pos="643"/>
+        </w:tabs>
+        <w:spacing w:line="240" w:lineRule="auto"/>
         <w:ind w:left="643" w:hanging="283"/>
         <w:rPr>
           <w:rFonts w:ascii="Calibri" w:hAnsi="Calibri"/>
@@ -1374,7 +1422,7 @@
     <w:p>
       <w:pPr>
         <w:pStyle w:val="TeksIsi"/>
-        <w:spacing w:before="123" w:line="237" w:lineRule="auto"/>
+        <w:spacing w:before="240"/>
         <w:ind w:left="360" w:right="52" w:firstLine="0"/>
       </w:pPr>
       <w:r>
@@ -1652,7 +1700,7 @@
         <w:tabs>
           <w:tab w:val="left" w:pos="643"/>
         </w:tabs>
-        <w:spacing w:before="118" w:line="237" w:lineRule="exact"/>
+        <w:spacing w:before="118" w:line="240" w:lineRule="auto"/>
         <w:ind w:left="643" w:hanging="283"/>
         <w:rPr>
           <w:rFonts w:ascii="Calibri" w:hAnsi="Calibri"/>
@@ -1690,6 +1738,7 @@
         <w:tabs>
           <w:tab w:val="left" w:pos="643"/>
         </w:tabs>
+        <w:spacing w:line="240" w:lineRule="auto"/>
         <w:ind w:left="643" w:hanging="283"/>
         <w:rPr>
           <w:rFonts w:ascii="Calibri" w:hAnsi="Calibri"/>
@@ -1714,7 +1763,7 @@
         <w:tabs>
           <w:tab w:val="left" w:pos="643"/>
         </w:tabs>
-        <w:spacing w:line="235" w:lineRule="exact"/>
+        <w:spacing w:line="240" w:lineRule="auto"/>
         <w:ind w:left="643" w:hanging="283"/>
         <w:rPr>
           <w:rFonts w:ascii="Calibri" w:hAnsi="Calibri"/>
@@ -1739,6 +1788,7 @@
         <w:tabs>
           <w:tab w:val="left" w:pos="643"/>
         </w:tabs>
+        <w:spacing w:line="240" w:lineRule="auto"/>
         <w:ind w:left="643" w:hanging="283"/>
         <w:rPr>
           <w:rFonts w:ascii="Calibri" w:hAnsi="Calibri"/>
@@ -1776,6 +1826,7 @@
         <w:tabs>
           <w:tab w:val="left" w:pos="643"/>
         </w:tabs>
+        <w:spacing w:line="240" w:lineRule="auto"/>
         <w:ind w:left="643" w:hanging="283"/>
         <w:rPr>
           <w:rFonts w:ascii="Calibri" w:hAnsi="Calibri"/>
@@ -1814,7 +1865,7 @@
         <w:tabs>
           <w:tab w:val="left" w:pos="643"/>
         </w:tabs>
-        <w:spacing w:line="235" w:lineRule="exact"/>
+        <w:spacing w:line="240" w:lineRule="auto"/>
         <w:ind w:left="643" w:hanging="283"/>
         <w:rPr>
           <w:rFonts w:ascii="Calibri" w:hAnsi="Calibri"/>
@@ -1839,7 +1890,7 @@
         <w:tabs>
           <w:tab w:val="left" w:pos="643"/>
         </w:tabs>
-        <w:spacing w:line="240" w:lineRule="exact"/>
+        <w:spacing w:line="240" w:lineRule="auto"/>
         <w:ind w:left="643" w:hanging="283"/>
         <w:rPr>
           <w:rFonts w:ascii="Calibri" w:hAnsi="Calibri"/>
@@ -1856,9 +1907,917 @@
     </w:p>
     <w:p>
       <w:pPr>
+        <w:pStyle w:val="DaftarParagraf"/>
+        <w:numPr>
+          <w:ilvl w:val="0"/>
+          <w:numId w:val="1"/>
+        </w:numPr>
+        <w:tabs>
+          <w:tab w:val="left" w:pos="643"/>
+        </w:tabs>
+        <w:spacing w:line="240" w:lineRule="auto"/>
+        <w:ind w:left="643" w:hanging="283"/>
+        <w:rPr>
+          <w:sz w:val="20"/>
+        </w:rPr>
+      </w:pPr>
+      <w:r>
+        <w:rPr>
+          <w:sz w:val="20"/>
+        </w:rPr>
+        <w:t>Independent Work</w:t>
+      </w:r>
+    </w:p>
+    <w:p>
+      <w:pPr>
         <w:pStyle w:val="TeksIsi"/>
-        <w:spacing w:before="215"/>
-        <w:ind w:left="0" w:firstLine="0"/>
+        <w:spacing w:before="106"/>
+        <w:ind w:left="644" w:firstLine="0"/>
+        <w:rPr>
+          <w:b/>
+        </w:rPr>
+      </w:pPr>
+      <w:r>
+        <w:rPr>
+          <w:b/>
+          <w:noProof/>
+        </w:rPr>
+        <mc:AlternateContent>
+          <mc:Choice Requires="wps">
+            <w:drawing>
+              <wp:anchor distT="0" distB="0" distL="0" distR="0" simplePos="0" relativeHeight="487593984" behindDoc="1" locked="0" layoutInCell="1" allowOverlap="1" wp14:anchorId="5AD5A6F5" wp14:editId="5172F638">
+                <wp:simplePos x="0" y="0"/>
+                <wp:positionH relativeFrom="page">
+                  <wp:posOffset>896111</wp:posOffset>
+                </wp:positionH>
+                <wp:positionV relativeFrom="paragraph">
+                  <wp:posOffset>228784</wp:posOffset>
+                </wp:positionV>
+                <wp:extent cx="5980430" cy="6350"/>
+                <wp:effectExtent l="0" t="0" r="0" b="0"/>
+                <wp:wrapTopAndBottom/>
+                <wp:docPr id="1834914539" name="Graphic 11"/>
+                <wp:cNvGraphicFramePr>
+                  <a:graphicFrameLocks xmlns:a="http://schemas.openxmlformats.org/drawingml/2006/main"/>
+                </wp:cNvGraphicFramePr>
+                <a:graphic xmlns:a="http://schemas.openxmlformats.org/drawingml/2006/main">
+                  <a:graphicData uri="http://schemas.microsoft.com/office/word/2010/wordprocessingShape">
+                    <wps:wsp>
+                      <wps:cNvSpPr>
+                        <a:spLocks/>
+                      </wps:cNvSpPr>
+                      <wps:spPr>
+                        <a:xfrm>
+                          <a:off x="0" y="0"/>
+                          <a:ext cx="5980430" cy="6350"/>
+                        </a:xfrm>
+                        <a:custGeom>
+                          <a:avLst/>
+                          <a:gdLst/>
+                          <a:ahLst/>
+                          <a:cxnLst/>
+                          <a:rect l="l" t="t" r="r" b="b"/>
+                          <a:pathLst>
+                            <a:path w="5980430" h="6350">
+                              <a:moveTo>
+                                <a:pt x="5980176" y="0"/>
+                              </a:moveTo>
+                              <a:lnTo>
+                                <a:pt x="0" y="0"/>
+                              </a:lnTo>
+                              <a:lnTo>
+                                <a:pt x="0" y="6096"/>
+                              </a:lnTo>
+                              <a:lnTo>
+                                <a:pt x="5980176" y="6096"/>
+                              </a:lnTo>
+                              <a:lnTo>
+                                <a:pt x="5980176" y="0"/>
+                              </a:lnTo>
+                              <a:close/>
+                            </a:path>
+                          </a:pathLst>
+                        </a:custGeom>
+                        <a:solidFill>
+                          <a:srgbClr val="A6A6A6"/>
+                        </a:solidFill>
+                      </wps:spPr>
+                      <wps:bodyPr wrap="square" lIns="0" tIns="0" rIns="0" bIns="0" rtlCol="0">
+                        <a:prstTxWarp prst="textNoShape">
+                          <a:avLst/>
+                        </a:prstTxWarp>
+                        <a:noAutofit/>
+                      </wps:bodyPr>
+                    </wps:wsp>
+                  </a:graphicData>
+                </a:graphic>
+              </wp:anchor>
+            </w:drawing>
+          </mc:Choice>
+          <mc:Fallback>
+            <w:pict>
+              <v:shape w14:anchorId="6EEEAB96" id="Graphic 11" o:spid="_x0000_s1026" style="position:absolute;margin-left:70.55pt;margin-top:18pt;width:470.9pt;height:.5pt;z-index:-15722496;visibility:visible;mso-wrap-style:square;mso-wrap-distance-left:0;mso-wrap-distance-top:0;mso-wrap-distance-right:0;mso-wrap-distance-bottom:0;mso-position-horizontal:absolute;mso-position-horizontal-relative:page;mso-position-vertical:absolute;mso-position-vertical-relative:text;v-text-anchor:top" coordsize="5980430,6350" o:gfxdata="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" path="m5980176,l,,,6096r5980176,l5980176,xe" fillcolor="#a6a6a6" stroked="f">
+                <v:path arrowok="t"/>
+                <w10:wrap type="topAndBottom" anchorx="page"/>
+              </v:shape>
+            </w:pict>
+          </mc:Fallback>
+        </mc:AlternateContent>
+      </w:r>
+    </w:p>
+    <w:p>
+      <w:pPr>
+        <w:pStyle w:val="Judul1"/>
+        <w:rPr>
+          <w:spacing w:val="-2"/>
+        </w:rPr>
+      </w:pPr>
+      <w:r>
+        <w:rPr>
+          <w:spacing w:val="-2"/>
+        </w:rPr>
+        <w:t>Projects</w:t>
+      </w:r>
+    </w:p>
+    <w:p>
+      <w:pPr>
+        <w:pStyle w:val="Judul2"/>
+      </w:pPr>
+      <w:r>
+        <w:t>Monitoring and controlling irrigation gates</w:t>
+      </w:r>
+      <w:r>
+        <w:t xml:space="preserve"> (</w:t>
+      </w:r>
+      <w:r>
+        <w:t>ESP32, PHP, MySQL, JavaScript</w:t>
+      </w:r>
+      <w:r>
+        <w:t>)</w:t>
+      </w:r>
+    </w:p>
+    <w:p>
+      <w:pPr>
+        <w:pStyle w:val="DaftarParagraf"/>
+        <w:numPr>
+          <w:ilvl w:val="1"/>
+          <w:numId w:val="1"/>
+        </w:numPr>
+        <w:tabs>
+          <w:tab w:val="left" w:pos="1079"/>
+        </w:tabs>
+        <w:spacing w:before="1" w:line="240" w:lineRule="auto"/>
+        <w:ind w:left="1079" w:hanging="359"/>
+        <w:rPr>
+          <w:sz w:val="20"/>
+        </w:rPr>
+      </w:pPr>
+      <w:r>
+        <w:rPr>
+          <w:sz w:val="20"/>
+        </w:rPr>
+        <w:t>Developed IoT system for real-time monitoring and remote control of irrigation gates</w:t>
+      </w:r>
+    </w:p>
+    <w:p>
+      <w:pPr>
+        <w:pStyle w:val="DaftarParagraf"/>
+        <w:numPr>
+          <w:ilvl w:val="1"/>
+          <w:numId w:val="1"/>
+        </w:numPr>
+        <w:tabs>
+          <w:tab w:val="left" w:pos="1079"/>
+        </w:tabs>
+        <w:spacing w:before="1" w:line="240" w:lineRule="auto"/>
+        <w:ind w:left="1079" w:hanging="359"/>
+        <w:rPr>
+          <w:sz w:val="20"/>
+        </w:rPr>
+      </w:pPr>
+      <w:r>
+        <w:rPr>
+          <w:sz w:val="20"/>
+        </w:rPr>
+        <w:t>Implemented ESP32-based data acquisition for water level and gate status</w:t>
+      </w:r>
+    </w:p>
+    <w:p>
+      <w:pPr>
+        <w:pStyle w:val="DaftarParagraf"/>
+        <w:numPr>
+          <w:ilvl w:val="1"/>
+          <w:numId w:val="1"/>
+        </w:numPr>
+        <w:tabs>
+          <w:tab w:val="left" w:pos="1079"/>
+        </w:tabs>
+        <w:spacing w:before="1" w:line="240" w:lineRule="auto"/>
+        <w:ind w:left="1079" w:hanging="359"/>
+        <w:rPr>
+          <w:sz w:val="20"/>
+        </w:rPr>
+      </w:pPr>
+      <w:r>
+        <w:rPr>
+          <w:sz w:val="20"/>
+        </w:rPr>
+        <w:t>Designed web dashboard for visualization and control interface</w:t>
+      </w:r>
+    </w:p>
+    <w:p>
+      <w:pPr>
+        <w:pStyle w:val="DaftarParagraf"/>
+        <w:numPr>
+          <w:ilvl w:val="1"/>
+          <w:numId w:val="1"/>
+        </w:numPr>
+        <w:tabs>
+          <w:tab w:val="left" w:pos="1079"/>
+        </w:tabs>
+        <w:spacing w:before="1" w:line="240" w:lineRule="auto"/>
+        <w:ind w:left="1079" w:hanging="359"/>
+        <w:rPr>
+          <w:sz w:val="20"/>
+        </w:rPr>
+      </w:pPr>
+      <w:r>
+        <w:rPr>
+          <w:sz w:val="20"/>
+        </w:rPr>
+        <w:t>Enabled efficient irrigation management by reducing manual monitoring</w:t>
+      </w:r>
+    </w:p>
+    <w:p>
+      <w:pPr>
+        <w:pStyle w:val="DaftarParagraf"/>
+        <w:tabs>
+          <w:tab w:val="left" w:pos="1079"/>
+        </w:tabs>
+        <w:spacing w:before="1" w:line="240" w:lineRule="auto"/>
+        <w:ind w:firstLine="0"/>
+        <w:rPr>
+          <w:sz w:val="20"/>
+        </w:rPr>
+      </w:pPr>
+    </w:p>
+    <w:p>
+      <w:pPr>
+        <w:pStyle w:val="Judul2"/>
+      </w:pPr>
+      <w:proofErr w:type="spellStart"/>
+      <w:r>
+        <w:t>Euforia</w:t>
+      </w:r>
+      <w:proofErr w:type="spellEnd"/>
+      <w:r>
+        <w:t xml:space="preserve"> - </w:t>
+      </w:r>
+      <w:r>
+        <w:t>PCB Defect Detection System (Python, Computer Vision, Deep Learning)</w:t>
+      </w:r>
+    </w:p>
+    <w:p>
+      <w:pPr>
+        <w:pStyle w:val="DaftarParagraf"/>
+        <w:numPr>
+          <w:ilvl w:val="1"/>
+          <w:numId w:val="1"/>
+        </w:numPr>
+        <w:tabs>
+          <w:tab w:val="left" w:pos="1079"/>
+        </w:tabs>
+        <w:spacing w:line="240" w:lineRule="auto"/>
+        <w:ind w:left="1079" w:hanging="359"/>
+        <w:rPr>
+          <w:sz w:val="20"/>
+        </w:rPr>
+      </w:pPr>
+      <w:r>
+        <w:rPr>
+          <w:sz w:val="20"/>
+        </w:rPr>
+        <w:t>Developed AI system for detecting PCB defects using image processing techniques</w:t>
+      </w:r>
+    </w:p>
+    <w:p>
+      <w:pPr>
+        <w:pStyle w:val="DaftarParagraf"/>
+        <w:numPr>
+          <w:ilvl w:val="1"/>
+          <w:numId w:val="1"/>
+        </w:numPr>
+        <w:tabs>
+          <w:tab w:val="left" w:pos="1079"/>
+        </w:tabs>
+        <w:spacing w:line="240" w:lineRule="auto"/>
+        <w:ind w:left="1079" w:hanging="359"/>
+        <w:rPr>
+          <w:sz w:val="20"/>
+        </w:rPr>
+      </w:pPr>
+      <w:r>
+        <w:rPr>
+          <w:sz w:val="20"/>
+        </w:rPr>
+        <w:t>Built a detection model to identify defective PCB boards</w:t>
+      </w:r>
+    </w:p>
+    <w:p>
+      <w:pPr>
+        <w:pStyle w:val="DaftarParagraf"/>
+        <w:tabs>
+          <w:tab w:val="left" w:pos="1079"/>
+        </w:tabs>
+        <w:spacing w:line="240" w:lineRule="auto"/>
+        <w:ind w:firstLine="0"/>
+        <w:rPr>
+          <w:sz w:val="20"/>
+        </w:rPr>
+      </w:pPr>
+    </w:p>
+    <w:p>
+      <w:pPr>
+        <w:pStyle w:val="Judul2"/>
+      </w:pPr>
+      <w:r>
+        <w:t>MP4 HD – Patient Monitor (Hardware Engineering, IoT)</w:t>
+      </w:r>
+    </w:p>
+    <w:p>
+      <w:pPr>
+        <w:pStyle w:val="DaftarParagraf"/>
+        <w:numPr>
+          <w:ilvl w:val="1"/>
+          <w:numId w:val="1"/>
+        </w:numPr>
+        <w:tabs>
+          <w:tab w:val="left" w:pos="1079"/>
+        </w:tabs>
+        <w:spacing w:line="240" w:lineRule="auto"/>
+        <w:ind w:left="1079" w:hanging="359"/>
+        <w:rPr>
+          <w:sz w:val="20"/>
+        </w:rPr>
+      </w:pPr>
+      <w:r>
+        <w:rPr>
+          <w:sz w:val="20"/>
+        </w:rPr>
+        <w:t xml:space="preserve">Developed a patient monitoring system for real-time health data observation </w:t>
+      </w:r>
+    </w:p>
+    <w:p>
+      <w:pPr>
+        <w:pStyle w:val="DaftarParagraf"/>
+        <w:numPr>
+          <w:ilvl w:val="1"/>
+          <w:numId w:val="1"/>
+        </w:numPr>
+        <w:tabs>
+          <w:tab w:val="left" w:pos="1079"/>
+        </w:tabs>
+        <w:spacing w:line="240" w:lineRule="auto"/>
+        <w:ind w:left="1079" w:hanging="359"/>
+        <w:rPr>
+          <w:sz w:val="20"/>
+        </w:rPr>
+      </w:pPr>
+      <w:r>
+        <w:rPr>
+          <w:sz w:val="20"/>
+        </w:rPr>
+        <w:t xml:space="preserve">Implemented hardware-based solution integrating sensors and microcontroller </w:t>
+      </w:r>
+    </w:p>
+    <w:p>
+      <w:pPr>
+        <w:pStyle w:val="DaftarParagraf"/>
+        <w:numPr>
+          <w:ilvl w:val="1"/>
+          <w:numId w:val="1"/>
+        </w:numPr>
+        <w:tabs>
+          <w:tab w:val="left" w:pos="1079"/>
+        </w:tabs>
+        <w:spacing w:line="240" w:lineRule="auto"/>
+        <w:ind w:left="1079" w:hanging="359"/>
+        <w:rPr>
+          <w:sz w:val="20"/>
+        </w:rPr>
+      </w:pPr>
+      <w:r>
+        <w:rPr>
+          <w:sz w:val="20"/>
+        </w:rPr>
+        <w:t xml:space="preserve">Completed as a final project for the MSIB6 </w:t>
+      </w:r>
+      <w:proofErr w:type="spellStart"/>
+      <w:r>
+        <w:rPr>
+          <w:sz w:val="20"/>
+        </w:rPr>
+        <w:t>Stechoq</w:t>
+      </w:r>
+      <w:proofErr w:type="spellEnd"/>
+      <w:r>
+        <w:rPr>
+          <w:sz w:val="20"/>
+        </w:rPr>
+        <w:t xml:space="preserve"> Hardware Engineering program</w:t>
+      </w:r>
+    </w:p>
+    <w:p>
+      <w:pPr>
+        <w:pStyle w:val="Judul2"/>
+      </w:pPr>
+      <w:r>
+        <w:lastRenderedPageBreak/>
+        <w:t xml:space="preserve">Landing Page – </w:t>
+      </w:r>
+      <w:proofErr w:type="spellStart"/>
+      <w:r>
+        <w:t>Pramuka</w:t>
+      </w:r>
+      <w:proofErr w:type="spellEnd"/>
+      <w:r>
+        <w:t xml:space="preserve"> SMANSA Poso (React.js</w:t>
+      </w:r>
+      <w:r>
+        <w:t>, Tailwind</w:t>
+      </w:r>
+      <w:r>
+        <w:t>)</w:t>
+      </w:r>
+    </w:p>
+    <w:p>
+      <w:pPr>
+        <w:pStyle w:val="DaftarParagraf"/>
+        <w:numPr>
+          <w:ilvl w:val="1"/>
+          <w:numId w:val="1"/>
+        </w:numPr>
+        <w:tabs>
+          <w:tab w:val="left" w:pos="1079"/>
+        </w:tabs>
+        <w:spacing w:line="240" w:lineRule="auto"/>
+        <w:ind w:left="1079" w:hanging="359"/>
+        <w:rPr>
+          <w:sz w:val="20"/>
+        </w:rPr>
+      </w:pPr>
+      <w:r>
+        <w:rPr>
+          <w:sz w:val="20"/>
+        </w:rPr>
+        <w:t xml:space="preserve">Developed responsive landing page using React.js </w:t>
+      </w:r>
+    </w:p>
+    <w:p>
+      <w:pPr>
+        <w:pStyle w:val="DaftarParagraf"/>
+        <w:numPr>
+          <w:ilvl w:val="1"/>
+          <w:numId w:val="1"/>
+        </w:numPr>
+        <w:tabs>
+          <w:tab w:val="left" w:pos="1079"/>
+        </w:tabs>
+        <w:spacing w:line="240" w:lineRule="auto"/>
+        <w:ind w:left="1079" w:hanging="359"/>
+        <w:rPr>
+          <w:sz w:val="20"/>
+        </w:rPr>
+      </w:pPr>
+      <w:r>
+        <w:rPr>
+          <w:sz w:val="20"/>
+        </w:rPr>
+        <w:t xml:space="preserve">Applied modern UI/UX principles for better user experience </w:t>
+      </w:r>
+    </w:p>
+    <w:p>
+      <w:pPr>
+        <w:pStyle w:val="DaftarParagraf"/>
+        <w:numPr>
+          <w:ilvl w:val="1"/>
+          <w:numId w:val="1"/>
+        </w:numPr>
+        <w:tabs>
+          <w:tab w:val="left" w:pos="1079"/>
+        </w:tabs>
+        <w:spacing w:line="240" w:lineRule="auto"/>
+        <w:ind w:left="1079" w:hanging="359"/>
+        <w:rPr>
+          <w:sz w:val="20"/>
+        </w:rPr>
+      </w:pPr>
+      <w:r>
+        <w:rPr>
+          <w:sz w:val="20"/>
+        </w:rPr>
+        <w:t>Contributed as a voluntary project for the organization</w:t>
+      </w:r>
+    </w:p>
+    <w:p>
+      <w:pPr>
+        <w:tabs>
+          <w:tab w:val="left" w:pos="1079"/>
+        </w:tabs>
+        <w:rPr>
+          <w:sz w:val="20"/>
+        </w:rPr>
+      </w:pPr>
+    </w:p>
+    <w:p>
+      <w:pPr>
+        <w:pStyle w:val="Judul2"/>
+      </w:pPr>
+      <w:r>
+        <w:t>Plant Monitoring System (IoT, ESP32, Sensors, Blynk)</w:t>
+      </w:r>
+    </w:p>
+    <w:p>
+      <w:pPr>
+        <w:pStyle w:val="DaftarParagraf"/>
+        <w:numPr>
+          <w:ilvl w:val="1"/>
+          <w:numId w:val="1"/>
+        </w:numPr>
+        <w:tabs>
+          <w:tab w:val="left" w:pos="1079"/>
+        </w:tabs>
+        <w:spacing w:line="240" w:lineRule="auto"/>
+        <w:ind w:left="1079" w:hanging="359"/>
+        <w:rPr>
+          <w:sz w:val="20"/>
+        </w:rPr>
+      </w:pPr>
+      <w:r>
+        <w:rPr>
+          <w:sz w:val="20"/>
+        </w:rPr>
+        <w:t xml:space="preserve">Developed an IoT-based system for real-time plant monitoring </w:t>
+      </w:r>
+    </w:p>
+    <w:p>
+      <w:pPr>
+        <w:pStyle w:val="DaftarParagraf"/>
+        <w:numPr>
+          <w:ilvl w:val="1"/>
+          <w:numId w:val="1"/>
+        </w:numPr>
+        <w:tabs>
+          <w:tab w:val="left" w:pos="1079"/>
+        </w:tabs>
+        <w:spacing w:line="240" w:lineRule="auto"/>
+        <w:ind w:left="1079" w:hanging="359"/>
+        <w:rPr>
+          <w:sz w:val="20"/>
+        </w:rPr>
+      </w:pPr>
+      <w:r>
+        <w:rPr>
+          <w:sz w:val="20"/>
+        </w:rPr>
+        <w:t xml:space="preserve">Integrated sensors with ESP32 for environmental data collection </w:t>
+      </w:r>
+    </w:p>
+    <w:p>
+      <w:pPr>
+        <w:pStyle w:val="DaftarParagraf"/>
+        <w:numPr>
+          <w:ilvl w:val="1"/>
+          <w:numId w:val="1"/>
+        </w:numPr>
+        <w:tabs>
+          <w:tab w:val="left" w:pos="1079"/>
+        </w:tabs>
+        <w:spacing w:line="240" w:lineRule="auto"/>
+        <w:ind w:left="1079" w:hanging="359"/>
+        <w:rPr>
+          <w:sz w:val="20"/>
+        </w:rPr>
+      </w:pPr>
+      <w:r>
+        <w:rPr>
+          <w:sz w:val="20"/>
+        </w:rPr>
+        <w:t xml:space="preserve">Utilized Blynk platform to build a real-time monitoring dashboard </w:t>
+      </w:r>
+    </w:p>
+    <w:p>
+      <w:pPr>
+        <w:pStyle w:val="DaftarParagraf"/>
+        <w:numPr>
+          <w:ilvl w:val="1"/>
+          <w:numId w:val="1"/>
+        </w:numPr>
+        <w:tabs>
+          <w:tab w:val="left" w:pos="1079"/>
+        </w:tabs>
+        <w:spacing w:line="240" w:lineRule="auto"/>
+        <w:ind w:left="1079" w:hanging="359"/>
+        <w:rPr>
+          <w:sz w:val="20"/>
+        </w:rPr>
+      </w:pPr>
+      <w:r>
+        <w:rPr>
+          <w:sz w:val="20"/>
+        </w:rPr>
+        <w:t>Delivered a reliable solution to support plant research and client requirements</w:t>
+      </w:r>
+    </w:p>
+    <w:p>
+      <w:pPr>
+        <w:pStyle w:val="DaftarParagraf"/>
+        <w:tabs>
+          <w:tab w:val="left" w:pos="1079"/>
+        </w:tabs>
+        <w:spacing w:line="240" w:lineRule="auto"/>
+        <w:ind w:firstLine="0"/>
+        <w:rPr>
+          <w:sz w:val="20"/>
+        </w:rPr>
+      </w:pPr>
+    </w:p>
+    <w:p>
+      <w:pPr>
+        <w:pStyle w:val="Judul2"/>
+      </w:pPr>
+      <w:r>
+        <w:t>Mobile Monitoring Application (React Native)</w:t>
+      </w:r>
+    </w:p>
+    <w:p>
+      <w:pPr>
+        <w:pStyle w:val="DaftarParagraf"/>
+        <w:numPr>
+          <w:ilvl w:val="1"/>
+          <w:numId w:val="1"/>
+        </w:numPr>
+        <w:tabs>
+          <w:tab w:val="left" w:pos="1079"/>
+        </w:tabs>
+        <w:spacing w:line="240" w:lineRule="auto"/>
+        <w:ind w:left="1079" w:hanging="359"/>
+        <w:rPr>
+          <w:sz w:val="20"/>
+        </w:rPr>
+      </w:pPr>
+      <w:r>
+        <w:rPr>
+          <w:sz w:val="20"/>
+        </w:rPr>
+        <w:t xml:space="preserve">Developed a mobile application for monitoring and controlling environmental parameters </w:t>
+      </w:r>
+    </w:p>
+    <w:p>
+      <w:pPr>
+        <w:pStyle w:val="DaftarParagraf"/>
+        <w:numPr>
+          <w:ilvl w:val="1"/>
+          <w:numId w:val="1"/>
+        </w:numPr>
+        <w:tabs>
+          <w:tab w:val="left" w:pos="1079"/>
+        </w:tabs>
+        <w:spacing w:line="240" w:lineRule="auto"/>
+        <w:ind w:left="1079" w:hanging="359"/>
+        <w:rPr>
+          <w:sz w:val="20"/>
+        </w:rPr>
+      </w:pPr>
+      <w:r>
+        <w:rPr>
+          <w:sz w:val="20"/>
+        </w:rPr>
+        <w:t xml:space="preserve">Implemented features to track temperature, humidity, soil pH, water quality, and lighting systems </w:t>
+      </w:r>
+    </w:p>
+    <w:p>
+      <w:pPr>
+        <w:pStyle w:val="DaftarParagraf"/>
+        <w:numPr>
+          <w:ilvl w:val="1"/>
+          <w:numId w:val="1"/>
+        </w:numPr>
+        <w:tabs>
+          <w:tab w:val="left" w:pos="1079"/>
+        </w:tabs>
+        <w:spacing w:line="240" w:lineRule="auto"/>
+        <w:ind w:left="1079" w:hanging="359"/>
+        <w:rPr>
+          <w:sz w:val="20"/>
+        </w:rPr>
+      </w:pPr>
+      <w:r>
+        <w:rPr>
+          <w:sz w:val="20"/>
+        </w:rPr>
+        <w:t xml:space="preserve">Designed user-friendly interface for real-time monitoring and control </w:t>
+      </w:r>
+    </w:p>
+    <w:p>
+      <w:pPr>
+        <w:pStyle w:val="DaftarParagraf"/>
+        <w:numPr>
+          <w:ilvl w:val="1"/>
+          <w:numId w:val="1"/>
+        </w:numPr>
+        <w:tabs>
+          <w:tab w:val="left" w:pos="1079"/>
+        </w:tabs>
+        <w:spacing w:line="240" w:lineRule="auto"/>
+        <w:ind w:left="1079" w:hanging="359"/>
+        <w:rPr>
+          <w:sz w:val="20"/>
+        </w:rPr>
+      </w:pPr>
+      <w:r>
+        <w:rPr>
+          <w:sz w:val="20"/>
+        </w:rPr>
+        <w:t>Delivered solution tailored to meet client requirements</w:t>
+      </w:r>
+    </w:p>
+    <w:p>
+      <w:pPr>
+        <w:pStyle w:val="DaftarParagraf"/>
+        <w:tabs>
+          <w:tab w:val="left" w:pos="1079"/>
+        </w:tabs>
+        <w:spacing w:line="240" w:lineRule="auto"/>
+        <w:ind w:firstLine="0"/>
+        <w:rPr>
+          <w:sz w:val="20"/>
+        </w:rPr>
+      </w:pPr>
+    </w:p>
+    <w:p>
+      <w:pPr>
+        <w:pStyle w:val="Judul2"/>
+      </w:pPr>
+      <w:r>
+        <w:t>Asset Inventory and Management Portal (React.js, TypeScript, Express.js, MySQL)</w:t>
+      </w:r>
+    </w:p>
+    <w:p>
+      <w:pPr>
+        <w:pStyle w:val="DaftarParagraf"/>
+        <w:numPr>
+          <w:ilvl w:val="1"/>
+          <w:numId w:val="1"/>
+        </w:numPr>
+        <w:tabs>
+          <w:tab w:val="left" w:pos="1079"/>
+        </w:tabs>
+        <w:spacing w:line="240" w:lineRule="auto"/>
+        <w:ind w:left="1079" w:hanging="359"/>
+        <w:rPr>
+          <w:sz w:val="20"/>
+        </w:rPr>
+      </w:pPr>
+      <w:r>
+        <w:rPr>
+          <w:sz w:val="20"/>
+        </w:rPr>
+        <w:t xml:space="preserve">Developed a </w:t>
+      </w:r>
+      <w:proofErr w:type="spellStart"/>
+      <w:r>
+        <w:rPr>
+          <w:sz w:val="20"/>
+        </w:rPr>
+        <w:t>fullstack</w:t>
+      </w:r>
+      <w:proofErr w:type="spellEnd"/>
+      <w:r>
+        <w:rPr>
+          <w:sz w:val="20"/>
+        </w:rPr>
+        <w:t xml:space="preserve"> web-based asset management system </w:t>
+      </w:r>
+    </w:p>
+    <w:p>
+      <w:pPr>
+        <w:pStyle w:val="DaftarParagraf"/>
+        <w:numPr>
+          <w:ilvl w:val="1"/>
+          <w:numId w:val="1"/>
+        </w:numPr>
+        <w:tabs>
+          <w:tab w:val="left" w:pos="1079"/>
+        </w:tabs>
+        <w:spacing w:line="240" w:lineRule="auto"/>
+        <w:ind w:left="1079" w:hanging="359"/>
+        <w:rPr>
+          <w:sz w:val="20"/>
+        </w:rPr>
+      </w:pPr>
+      <w:r>
+        <w:rPr>
+          <w:sz w:val="20"/>
+        </w:rPr>
+        <w:t xml:space="preserve">Built frontend using React.js and TypeScript for responsive and scalable UI </w:t>
+      </w:r>
+    </w:p>
+    <w:p>
+      <w:pPr>
+        <w:pStyle w:val="DaftarParagraf"/>
+        <w:numPr>
+          <w:ilvl w:val="1"/>
+          <w:numId w:val="1"/>
+        </w:numPr>
+        <w:tabs>
+          <w:tab w:val="left" w:pos="1079"/>
+        </w:tabs>
+        <w:spacing w:line="240" w:lineRule="auto"/>
+        <w:ind w:left="1079" w:hanging="359"/>
+        <w:rPr>
+          <w:sz w:val="20"/>
+        </w:rPr>
+      </w:pPr>
+      <w:r>
+        <w:rPr>
+          <w:sz w:val="20"/>
+        </w:rPr>
+        <w:t xml:space="preserve">Developed RESTful API using Express.js for data processing and integration </w:t>
+      </w:r>
+    </w:p>
+    <w:p>
+      <w:pPr>
+        <w:pStyle w:val="DaftarParagraf"/>
+        <w:numPr>
+          <w:ilvl w:val="1"/>
+          <w:numId w:val="1"/>
+        </w:numPr>
+        <w:tabs>
+          <w:tab w:val="left" w:pos="1079"/>
+        </w:tabs>
+        <w:spacing w:line="240" w:lineRule="auto"/>
+        <w:ind w:left="1079" w:hanging="359"/>
+        <w:rPr>
+          <w:sz w:val="20"/>
+        </w:rPr>
+      </w:pPr>
+      <w:r>
+        <w:rPr>
+          <w:sz w:val="20"/>
+        </w:rPr>
+        <w:t xml:space="preserve">Implemented asset inventory, tracking, and management features </w:t>
+      </w:r>
+    </w:p>
+    <w:p>
+      <w:pPr>
+        <w:pStyle w:val="DaftarParagraf"/>
+        <w:numPr>
+          <w:ilvl w:val="1"/>
+          <w:numId w:val="1"/>
+        </w:numPr>
+        <w:tabs>
+          <w:tab w:val="left" w:pos="1079"/>
+        </w:tabs>
+        <w:spacing w:line="240" w:lineRule="auto"/>
+        <w:ind w:left="1079" w:hanging="359"/>
+        <w:rPr>
+          <w:sz w:val="20"/>
+        </w:rPr>
+      </w:pPr>
+      <w:r>
+        <w:rPr>
+          <w:sz w:val="20"/>
+        </w:rPr>
+        <w:t xml:space="preserve">Improved transparency and efficiency in municipal asset administration </w:t>
+      </w:r>
+    </w:p>
+    <w:p>
+      <w:pPr>
+        <w:pStyle w:val="DaftarParagraf"/>
+        <w:numPr>
+          <w:ilvl w:val="1"/>
+          <w:numId w:val="1"/>
+        </w:numPr>
+        <w:tabs>
+          <w:tab w:val="left" w:pos="1079"/>
+        </w:tabs>
+        <w:spacing w:line="240" w:lineRule="auto"/>
+        <w:ind w:left="1079" w:hanging="359"/>
+        <w:rPr>
+          <w:sz w:val="20"/>
+        </w:rPr>
+      </w:pPr>
+      <w:r>
+        <w:rPr>
+          <w:sz w:val="20"/>
+        </w:rPr>
+        <w:t>Delivered solution for Palu City Environmental Department</w:t>
+      </w:r>
+    </w:p>
+    <w:p>
+      <w:pPr>
+        <w:spacing w:before="220"/>
       </w:pPr>
       <w:r>
         <w:rPr>
@@ -1870,13 +2829,13 @@
               <wp:anchor distT="0" distB="0" distL="0" distR="0" simplePos="0" relativeHeight="487589376" behindDoc="1" locked="0" layoutInCell="1" allowOverlap="1">
                 <wp:simplePos x="0" y="0"/>
                 <wp:positionH relativeFrom="page">
-                  <wp:posOffset>896111</wp:posOffset>
+                  <wp:posOffset>895985</wp:posOffset>
                 </wp:positionH>
                 <wp:positionV relativeFrom="paragraph">
-                  <wp:posOffset>298248</wp:posOffset>
+                  <wp:posOffset>468084</wp:posOffset>
                 </wp:positionV>
                 <wp:extent cx="5980430" cy="6350"/>
-                <wp:effectExtent l="0" t="0" r="0" b="0"/>
+                <wp:effectExtent l="0" t="0" r="1270" b="6350"/>
                 <wp:wrapTopAndBottom/>
                 <wp:docPr id="10" name="Graphic 10"/>
                 <wp:cNvGraphicFramePr>
@@ -1936,12 +2895,12 @@
               </wp:anchor>
             </w:drawing>
           </mc:Choice>
-          <mc:Fallback xmlns:ve="http://schemas.openxmlformats.org/markup-compatibility/2006" xmlns:a="http://schemas.openxmlformats.org/drawingml/2006/main" xmlns:pic="http://schemas.openxmlformats.org/drawingml/2006/picture">
+          <mc:Fallback>
             <w:pict>
-              <v:rect style="position:absolute;margin-left:70.559998pt;margin-top:23.484154pt;width:470.88pt;height:.48pt;mso-position-horizontal-relative:page;mso-position-vertical-relative:paragraph;z-index:-15727104;mso-wrap-distance-left:0;mso-wrap-distance-right:0" id="docshape5" filled="true" fillcolor="#a6a6a6" stroked="false">
-                <v:fill type="solid"/>
-                <w10:wrap type="topAndBottom"/>
-              </v:rect>
+              <v:shape w14:anchorId="4D89A8F1" id="Graphic 10" o:spid="_x0000_s1026" style="position:absolute;margin-left:70.55pt;margin-top:36.85pt;width:470.9pt;height:.5pt;z-index:-15727104;visibility:visible;mso-wrap-style:square;mso-wrap-distance-left:0;mso-wrap-distance-top:0;mso-wrap-distance-right:0;mso-wrap-distance-bottom:0;mso-position-horizontal:absolute;mso-position-horizontal-relative:page;mso-position-vertical:absolute;mso-position-vertical-relative:text;v-text-anchor:top" coordsize="5980430,6350" o:gfxdata="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" path="m5980176,l,,,6096r5980176,l5980176,xe" fillcolor="#a6a6a6" stroked="f">
+                <v:path arrowok="t"/>
+                <w10:wrap type="topAndBottom" anchorx="page"/>
+              </v:shape>
             </w:pict>
           </mc:Fallback>
         </mc:AlternateContent>
@@ -2291,7 +3250,7 @@
     <w:p>
       <w:pPr>
         <w:pStyle w:val="TeksIsi"/>
-        <w:spacing w:before="226"/>
+        <w:spacing w:before="240"/>
         <w:ind w:left="0" w:firstLine="0"/>
       </w:pPr>
       <w:r>
@@ -2472,13 +3431,8 @@
         </w:rPr>
         <w:t xml:space="preserve"> </w:t>
       </w:r>
-      <w:proofErr w:type="spellStart"/>
-      <w:r>
-        <w:t>Palu</w:t>
-      </w:r>
-      <w:proofErr w:type="spellEnd"/>
-      <w:r>
-        <w:t>,</w:t>
+      <w:r>
+        <w:t>Palu,</w:t>
       </w:r>
       <w:r>
         <w:rPr>
@@ -2647,7 +3601,6 @@
         <w:pStyle w:val="Judul2"/>
       </w:pPr>
       <w:r>
-        <w:lastRenderedPageBreak/>
         <w:t>Study</w:t>
       </w:r>
       <w:r>
@@ -2718,7 +3671,7 @@
         <w:tabs>
           <w:tab w:val="left" w:pos="1079"/>
         </w:tabs>
-        <w:spacing w:before="1" w:line="240" w:lineRule="exact"/>
+        <w:spacing w:before="1" w:line="240" w:lineRule="auto"/>
         <w:ind w:left="1079" w:hanging="359"/>
         <w:rPr>
           <w:sz w:val="20"/>
@@ -2755,7 +3708,7 @@
         <w:tabs>
           <w:tab w:val="left" w:pos="1079"/>
         </w:tabs>
-        <w:spacing w:line="235" w:lineRule="exact"/>
+        <w:spacing w:line="240" w:lineRule="auto"/>
         <w:ind w:left="1079" w:hanging="359"/>
         <w:rPr>
           <w:sz w:val="20"/>
@@ -2792,6 +3745,7 @@
         <w:tabs>
           <w:tab w:val="left" w:pos="1079"/>
         </w:tabs>
+        <w:spacing w:line="240" w:lineRule="auto"/>
         <w:ind w:left="1079" w:hanging="359"/>
         <w:rPr>
           <w:sz w:val="20"/>
@@ -2828,6 +3782,7 @@
         <w:tabs>
           <w:tab w:val="left" w:pos="1079"/>
         </w:tabs>
+        <w:spacing w:line="240" w:lineRule="auto"/>
         <w:ind w:left="1079" w:hanging="359"/>
         <w:rPr>
           <w:sz w:val="20"/>
@@ -2903,7 +3858,7 @@
         <w:tabs>
           <w:tab w:val="left" w:pos="1079"/>
         </w:tabs>
-        <w:spacing w:line="235" w:lineRule="exact"/>
+        <w:spacing w:line="240" w:lineRule="auto"/>
         <w:ind w:left="1079" w:hanging="359"/>
         <w:rPr>
           <w:sz w:val="20"/>
@@ -2940,7 +3895,7 @@
         <w:tabs>
           <w:tab w:val="left" w:pos="1079"/>
         </w:tabs>
-        <w:spacing w:line="240" w:lineRule="exact"/>
+        <w:spacing w:line="240" w:lineRule="auto"/>
         <w:ind w:left="1079" w:hanging="359"/>
         <w:rPr>
           <w:sz w:val="20"/>
@@ -3098,7 +4053,7 @@
         <w:tabs>
           <w:tab w:val="left" w:pos="1079"/>
         </w:tabs>
-        <w:spacing w:before="1" w:line="240" w:lineRule="exact"/>
+        <w:spacing w:before="1" w:line="240" w:lineRule="auto"/>
         <w:ind w:left="1079" w:hanging="359"/>
         <w:rPr>
           <w:sz w:val="20"/>
@@ -3148,7 +4103,7 @@
         <w:tabs>
           <w:tab w:val="left" w:pos="1079"/>
         </w:tabs>
-        <w:spacing w:line="235" w:lineRule="exact"/>
+        <w:spacing w:line="240" w:lineRule="auto"/>
         <w:ind w:left="1079" w:hanging="359"/>
         <w:rPr>
           <w:sz w:val="20"/>
@@ -3198,7 +4153,7 @@
         <w:tabs>
           <w:tab w:val="left" w:pos="1079"/>
         </w:tabs>
-        <w:spacing w:line="240" w:lineRule="exact"/>
+        <w:spacing w:line="240" w:lineRule="auto"/>
         <w:ind w:left="1079" w:hanging="359"/>
         <w:rPr>
           <w:sz w:val="20"/>
@@ -3343,6 +4298,7 @@
         <w:tabs>
           <w:tab w:val="left" w:pos="1079"/>
         </w:tabs>
+        <w:spacing w:line="240" w:lineRule="auto"/>
         <w:ind w:left="1079" w:hanging="359"/>
         <w:rPr>
           <w:sz w:val="20"/>
@@ -3431,7 +4387,7 @@
         <w:tabs>
           <w:tab w:val="left" w:pos="1079"/>
         </w:tabs>
-        <w:spacing w:line="235" w:lineRule="exact"/>
+        <w:spacing w:line="240" w:lineRule="auto"/>
         <w:ind w:left="1079" w:hanging="359"/>
         <w:rPr>
           <w:sz w:val="20"/>
@@ -3481,6 +4437,7 @@
         <w:tabs>
           <w:tab w:val="left" w:pos="1079"/>
         </w:tabs>
+        <w:spacing w:line="240" w:lineRule="auto"/>
         <w:ind w:left="1079" w:hanging="359"/>
         <w:rPr>
           <w:sz w:val="20"/>
@@ -3517,6 +4474,7 @@
         <w:tabs>
           <w:tab w:val="left" w:pos="1079"/>
         </w:tabs>
+        <w:spacing w:line="240" w:lineRule="auto"/>
         <w:ind w:left="1079" w:hanging="359"/>
         <w:rPr>
           <w:sz w:val="20"/>
@@ -3540,7 +4498,7 @@
         <w:tabs>
           <w:tab w:val="left" w:pos="1079"/>
         </w:tabs>
-        <w:spacing w:line="235" w:lineRule="exact"/>
+        <w:spacing w:line="240" w:lineRule="auto"/>
         <w:ind w:left="1079" w:hanging="359"/>
         <w:rPr>
           <w:sz w:val="20"/>
@@ -3550,6 +4508,7 @@
         <w:rPr>
           <w:sz w:val="20"/>
         </w:rPr>
+        <w:lastRenderedPageBreak/>
         <w:t>Wireless</w:t>
       </w:r>
       <w:r>
@@ -3559,14 +4518,12 @@
         </w:rPr>
         <w:t xml:space="preserve"> </w:t>
       </w:r>
-      <w:proofErr w:type="spellStart"/>
       <w:r>
         <w:rPr>
           <w:sz w:val="20"/>
         </w:rPr>
         <w:t>Comunication</w:t>
       </w:r>
-      <w:proofErr w:type="spellEnd"/>
       <w:r>
         <w:rPr>
           <w:spacing w:val="-11"/>
@@ -3592,7 +4549,7 @@
         <w:tabs>
           <w:tab w:val="left" w:pos="1079"/>
         </w:tabs>
-        <w:spacing w:line="240" w:lineRule="exact"/>
+        <w:spacing w:line="240" w:lineRule="auto"/>
         <w:ind w:left="1079" w:hanging="359"/>
         <w:rPr>
           <w:sz w:val="20"/>
@@ -3644,765 +4601,6 @@
         </w:rPr>
         <w:t>Electronic</w:t>
       </w:r>
-    </w:p>
-    <w:p>
-      <w:pPr>
-        <w:spacing w:before="220"/>
-        <w:ind w:left="360"/>
-        <w:rPr>
-          <w:sz w:val="18"/>
-        </w:rPr>
-      </w:pPr>
-      <w:r>
-        <w:rPr>
-          <w:sz w:val="18"/>
-        </w:rPr>
-        <w:t>A</w:t>
-      </w:r>
-      <w:r>
-        <w:rPr>
-          <w:spacing w:val="-4"/>
-          <w:sz w:val="18"/>
-        </w:rPr>
-        <w:t xml:space="preserve"> </w:t>
-      </w:r>
-      <w:r>
-        <w:rPr>
-          <w:sz w:val="18"/>
-        </w:rPr>
-        <w:t>timeless</w:t>
-      </w:r>
-      <w:r>
-        <w:rPr>
-          <w:spacing w:val="-2"/>
-          <w:sz w:val="18"/>
-        </w:rPr>
-        <w:t xml:space="preserve"> period</w:t>
-      </w:r>
-    </w:p>
-    <w:p>
-      <w:pPr>
-        <w:pStyle w:val="Judul2"/>
-      </w:pPr>
-      <w:r>
-        <w:t>Node</w:t>
-      </w:r>
-      <w:r>
-        <w:rPr>
-          <w:spacing w:val="-7"/>
-        </w:rPr>
-        <w:t xml:space="preserve"> </w:t>
-      </w:r>
-      <w:r>
-        <w:t>JS</w:t>
-      </w:r>
-      <w:r>
-        <w:rPr>
-          <w:spacing w:val="-6"/>
-        </w:rPr>
-        <w:t xml:space="preserve"> </w:t>
-      </w:r>
-      <w:r>
-        <w:t>Tutorial</w:t>
-      </w:r>
-      <w:r>
-        <w:rPr>
-          <w:spacing w:val="-6"/>
-        </w:rPr>
-        <w:t xml:space="preserve"> </w:t>
-      </w:r>
-      <w:r>
-        <w:t>at</w:t>
-      </w:r>
-      <w:r>
-        <w:rPr>
-          <w:spacing w:val="-6"/>
-        </w:rPr>
-        <w:t xml:space="preserve"> </w:t>
-      </w:r>
-      <w:r>
-        <w:t>Programmer</w:t>
-      </w:r>
-      <w:r>
-        <w:rPr>
-          <w:spacing w:val="-6"/>
-        </w:rPr>
-        <w:t xml:space="preserve"> </w:t>
-      </w:r>
-      <w:r>
-        <w:t>Zaman</w:t>
-      </w:r>
-      <w:r>
-        <w:rPr>
-          <w:spacing w:val="-6"/>
-        </w:rPr>
-        <w:t xml:space="preserve"> </w:t>
-      </w:r>
-      <w:r>
-        <w:rPr>
-          <w:spacing w:val="-5"/>
-        </w:rPr>
-        <w:t>Now</w:t>
-      </w:r>
-    </w:p>
-    <w:p>
-      <w:pPr>
-        <w:pStyle w:val="DaftarParagraf"/>
-        <w:numPr>
-          <w:ilvl w:val="1"/>
-          <w:numId w:val="1"/>
-        </w:numPr>
-        <w:tabs>
-          <w:tab w:val="left" w:pos="1079"/>
-        </w:tabs>
-        <w:spacing w:before="1" w:line="237" w:lineRule="exact"/>
-        <w:ind w:left="1079" w:hanging="359"/>
-        <w:rPr>
-          <w:sz w:val="20"/>
-        </w:rPr>
-      </w:pPr>
-      <w:r>
-        <w:rPr>
-          <w:sz w:val="20"/>
-        </w:rPr>
-        <w:t>Node</w:t>
-      </w:r>
-      <w:r>
-        <w:rPr>
-          <w:spacing w:val="-4"/>
-          <w:sz w:val="20"/>
-        </w:rPr>
-        <w:t xml:space="preserve"> </w:t>
-      </w:r>
-      <w:r>
-        <w:rPr>
-          <w:sz w:val="20"/>
-        </w:rPr>
-        <w:t>JS</w:t>
-      </w:r>
-      <w:r>
-        <w:rPr>
-          <w:spacing w:val="-3"/>
-          <w:sz w:val="20"/>
-        </w:rPr>
-        <w:t xml:space="preserve"> </w:t>
-      </w:r>
-      <w:r>
-        <w:rPr>
-          <w:spacing w:val="-2"/>
-          <w:sz w:val="20"/>
-        </w:rPr>
-        <w:t>Foundation</w:t>
-      </w:r>
-    </w:p>
-    <w:p>
-      <w:pPr>
-        <w:pStyle w:val="DaftarParagraf"/>
-        <w:numPr>
-          <w:ilvl w:val="1"/>
-          <w:numId w:val="1"/>
-        </w:numPr>
-        <w:tabs>
-          <w:tab w:val="left" w:pos="1079"/>
-        </w:tabs>
-        <w:ind w:left="1079" w:hanging="359"/>
-        <w:rPr>
-          <w:sz w:val="20"/>
-        </w:rPr>
-      </w:pPr>
-      <w:proofErr w:type="spellStart"/>
-      <w:r>
-        <w:rPr>
-          <w:sz w:val="20"/>
-        </w:rPr>
-        <w:t>Todolist</w:t>
-      </w:r>
-      <w:proofErr w:type="spellEnd"/>
-      <w:r>
-        <w:rPr>
-          <w:spacing w:val="-8"/>
-          <w:sz w:val="20"/>
-        </w:rPr>
-        <w:t xml:space="preserve"> </w:t>
-      </w:r>
-      <w:r>
-        <w:rPr>
-          <w:spacing w:val="-5"/>
-          <w:sz w:val="20"/>
-        </w:rPr>
-        <w:t>API</w:t>
-      </w:r>
-    </w:p>
-    <w:p>
-      <w:pPr>
-        <w:pStyle w:val="DaftarParagraf"/>
-        <w:numPr>
-          <w:ilvl w:val="1"/>
-          <w:numId w:val="1"/>
-        </w:numPr>
-        <w:tabs>
-          <w:tab w:val="left" w:pos="1079"/>
-        </w:tabs>
-        <w:spacing w:line="235" w:lineRule="exact"/>
-        <w:ind w:left="1079" w:hanging="359"/>
-        <w:rPr>
-          <w:sz w:val="20"/>
-        </w:rPr>
-      </w:pPr>
-      <w:r>
-        <w:rPr>
-          <w:sz w:val="20"/>
-        </w:rPr>
-        <w:t>Node</w:t>
-      </w:r>
-      <w:r>
-        <w:rPr>
-          <w:spacing w:val="-7"/>
-          <w:sz w:val="20"/>
-        </w:rPr>
-        <w:t xml:space="preserve"> </w:t>
-      </w:r>
-      <w:r>
-        <w:rPr>
-          <w:sz w:val="20"/>
-        </w:rPr>
-        <w:t>Package</w:t>
-      </w:r>
-      <w:r>
-        <w:rPr>
-          <w:spacing w:val="-7"/>
-          <w:sz w:val="20"/>
-        </w:rPr>
-        <w:t xml:space="preserve"> </w:t>
-      </w:r>
-      <w:r>
-        <w:rPr>
-          <w:sz w:val="20"/>
-        </w:rPr>
-        <w:t>Manager</w:t>
-      </w:r>
-      <w:r>
-        <w:rPr>
-          <w:spacing w:val="-6"/>
-          <w:sz w:val="20"/>
-        </w:rPr>
-        <w:t xml:space="preserve"> </w:t>
-      </w:r>
-      <w:r>
-        <w:rPr>
-          <w:spacing w:val="-4"/>
-          <w:sz w:val="20"/>
-        </w:rPr>
-        <w:t>(NPM)</w:t>
-      </w:r>
-    </w:p>
-    <w:p>
-      <w:pPr>
-        <w:pStyle w:val="DaftarParagraf"/>
-        <w:numPr>
-          <w:ilvl w:val="1"/>
-          <w:numId w:val="1"/>
-        </w:numPr>
-        <w:tabs>
-          <w:tab w:val="left" w:pos="1079"/>
-        </w:tabs>
-        <w:ind w:left="1079" w:hanging="359"/>
-        <w:rPr>
-          <w:sz w:val="20"/>
-        </w:rPr>
-      </w:pPr>
-      <w:r>
-        <w:rPr>
-          <w:sz w:val="20"/>
-        </w:rPr>
-        <w:t>Unit</w:t>
-      </w:r>
-      <w:r>
-        <w:rPr>
-          <w:spacing w:val="-7"/>
-          <w:sz w:val="20"/>
-        </w:rPr>
-        <w:t xml:space="preserve"> </w:t>
-      </w:r>
-      <w:r>
-        <w:rPr>
-          <w:spacing w:val="-4"/>
-          <w:sz w:val="20"/>
-        </w:rPr>
-        <w:t>Test</w:t>
-      </w:r>
-    </w:p>
-    <w:p>
-      <w:pPr>
-        <w:pStyle w:val="DaftarParagraf"/>
-        <w:numPr>
-          <w:ilvl w:val="1"/>
-          <w:numId w:val="1"/>
-        </w:numPr>
-        <w:tabs>
-          <w:tab w:val="left" w:pos="1079"/>
-        </w:tabs>
-        <w:ind w:left="1079" w:hanging="359"/>
-        <w:rPr>
-          <w:sz w:val="20"/>
-        </w:rPr>
-      </w:pPr>
-      <w:r>
-        <w:rPr>
-          <w:spacing w:val="-2"/>
-          <w:sz w:val="20"/>
-        </w:rPr>
-        <w:t>Logging</w:t>
-      </w:r>
-    </w:p>
-    <w:p>
-      <w:pPr>
-        <w:pStyle w:val="DaftarParagraf"/>
-        <w:numPr>
-          <w:ilvl w:val="1"/>
-          <w:numId w:val="1"/>
-        </w:numPr>
-        <w:tabs>
-          <w:tab w:val="left" w:pos="1079"/>
-        </w:tabs>
-        <w:spacing w:line="235" w:lineRule="exact"/>
-        <w:ind w:left="1079" w:hanging="359"/>
-        <w:rPr>
-          <w:sz w:val="20"/>
-        </w:rPr>
-      </w:pPr>
-      <w:r>
-        <w:rPr>
-          <w:spacing w:val="-2"/>
-          <w:sz w:val="20"/>
-        </w:rPr>
-        <w:t>Mustache</w:t>
-      </w:r>
-    </w:p>
-    <w:p>
-      <w:pPr>
-        <w:pStyle w:val="DaftarParagraf"/>
-        <w:numPr>
-          <w:ilvl w:val="1"/>
-          <w:numId w:val="1"/>
-        </w:numPr>
-        <w:tabs>
-          <w:tab w:val="left" w:pos="1079"/>
-        </w:tabs>
-        <w:spacing w:line="235" w:lineRule="exact"/>
-        <w:ind w:left="1079" w:hanging="359"/>
-        <w:rPr>
-          <w:sz w:val="20"/>
-        </w:rPr>
-      </w:pPr>
-      <w:r>
-        <w:rPr>
-          <w:sz w:val="20"/>
-        </w:rPr>
-        <w:t>Prisma</w:t>
-      </w:r>
-      <w:r>
-        <w:rPr>
-          <w:spacing w:val="-7"/>
-          <w:sz w:val="20"/>
-        </w:rPr>
-        <w:t xml:space="preserve"> </w:t>
-      </w:r>
-      <w:r>
-        <w:rPr>
-          <w:spacing w:val="-5"/>
-          <w:sz w:val="20"/>
-        </w:rPr>
-        <w:t>ORM</w:t>
-      </w:r>
-    </w:p>
-    <w:p>
-      <w:pPr>
-        <w:pStyle w:val="DaftarParagraf"/>
-        <w:numPr>
-          <w:ilvl w:val="1"/>
-          <w:numId w:val="1"/>
-        </w:numPr>
-        <w:tabs>
-          <w:tab w:val="left" w:pos="1079"/>
-        </w:tabs>
-        <w:ind w:left="1079" w:hanging="359"/>
-        <w:rPr>
-          <w:sz w:val="20"/>
-        </w:rPr>
-      </w:pPr>
-      <w:r>
-        <w:rPr>
-          <w:spacing w:val="-2"/>
-          <w:sz w:val="20"/>
-        </w:rPr>
-        <w:t>Validation</w:t>
-      </w:r>
-    </w:p>
-    <w:p>
-      <w:pPr>
-        <w:pStyle w:val="DaftarParagraf"/>
-        <w:numPr>
-          <w:ilvl w:val="1"/>
-          <w:numId w:val="1"/>
-        </w:numPr>
-        <w:tabs>
-          <w:tab w:val="left" w:pos="1079"/>
-        </w:tabs>
-        <w:ind w:left="1079" w:hanging="359"/>
-        <w:rPr>
-          <w:sz w:val="20"/>
-        </w:rPr>
-      </w:pPr>
-      <w:r>
-        <w:rPr>
-          <w:sz w:val="20"/>
-        </w:rPr>
-        <w:t>REST</w:t>
-      </w:r>
-      <w:r>
-        <w:rPr>
-          <w:spacing w:val="-6"/>
-          <w:sz w:val="20"/>
-        </w:rPr>
-        <w:t xml:space="preserve"> </w:t>
-      </w:r>
-      <w:r>
-        <w:rPr>
-          <w:sz w:val="20"/>
-        </w:rPr>
-        <w:t>Full</w:t>
-      </w:r>
-      <w:r>
-        <w:rPr>
-          <w:spacing w:val="-5"/>
-          <w:sz w:val="20"/>
-        </w:rPr>
-        <w:t xml:space="preserve"> API</w:t>
-      </w:r>
-    </w:p>
-    <w:p>
-      <w:pPr>
-        <w:pStyle w:val="DaftarParagraf"/>
-        <w:numPr>
-          <w:ilvl w:val="1"/>
-          <w:numId w:val="1"/>
-        </w:numPr>
-        <w:tabs>
-          <w:tab w:val="left" w:pos="1079"/>
-        </w:tabs>
-        <w:spacing w:line="235" w:lineRule="exact"/>
-        <w:ind w:left="1079" w:hanging="359"/>
-        <w:rPr>
-          <w:sz w:val="20"/>
-        </w:rPr>
-      </w:pPr>
-      <w:proofErr w:type="spellStart"/>
-      <w:r>
-        <w:rPr>
-          <w:spacing w:val="-2"/>
-          <w:sz w:val="20"/>
-        </w:rPr>
-        <w:t>ESLint</w:t>
-      </w:r>
-      <w:proofErr w:type="spellEnd"/>
-    </w:p>
-    <w:p>
-      <w:pPr>
-        <w:pStyle w:val="DaftarParagraf"/>
-        <w:numPr>
-          <w:ilvl w:val="1"/>
-          <w:numId w:val="1"/>
-        </w:numPr>
-        <w:tabs>
-          <w:tab w:val="left" w:pos="1079"/>
-        </w:tabs>
-        <w:ind w:left="1079" w:hanging="359"/>
-        <w:rPr>
-          <w:sz w:val="20"/>
-        </w:rPr>
-      </w:pPr>
-      <w:r>
-        <w:rPr>
-          <w:spacing w:val="-2"/>
-          <w:sz w:val="20"/>
-        </w:rPr>
-        <w:t>Redis</w:t>
-      </w:r>
-    </w:p>
-    <w:p>
-      <w:pPr>
-        <w:pStyle w:val="DaftarParagraf"/>
-        <w:numPr>
-          <w:ilvl w:val="1"/>
-          <w:numId w:val="1"/>
-        </w:numPr>
-        <w:tabs>
-          <w:tab w:val="left" w:pos="1079"/>
-        </w:tabs>
-        <w:spacing w:line="237" w:lineRule="exact"/>
-        <w:ind w:left="1079" w:hanging="359"/>
-        <w:rPr>
-          <w:sz w:val="20"/>
-        </w:rPr>
-      </w:pPr>
-      <w:proofErr w:type="spellStart"/>
-      <w:r>
-        <w:rPr>
-          <w:spacing w:val="-2"/>
-          <w:sz w:val="20"/>
-        </w:rPr>
-        <w:t>Axios</w:t>
-      </w:r>
-      <w:proofErr w:type="spellEnd"/>
-    </w:p>
-    <w:p>
-      <w:pPr>
-        <w:spacing w:before="220"/>
-        <w:ind w:left="360"/>
-        <w:rPr>
-          <w:sz w:val="18"/>
-        </w:rPr>
-      </w:pPr>
-      <w:r>
-        <w:rPr>
-          <w:sz w:val="18"/>
-        </w:rPr>
-        <w:t>A</w:t>
-      </w:r>
-      <w:r>
-        <w:rPr>
-          <w:spacing w:val="-4"/>
-          <w:sz w:val="18"/>
-        </w:rPr>
-        <w:t xml:space="preserve"> </w:t>
-      </w:r>
-      <w:r>
-        <w:rPr>
-          <w:sz w:val="18"/>
-        </w:rPr>
-        <w:t>timeless</w:t>
-      </w:r>
-      <w:r>
-        <w:rPr>
-          <w:spacing w:val="-2"/>
-          <w:sz w:val="18"/>
-        </w:rPr>
-        <w:t xml:space="preserve"> period</w:t>
-      </w:r>
-    </w:p>
-    <w:p>
-      <w:pPr>
-        <w:pStyle w:val="Judul2"/>
-        <w:spacing w:before="38"/>
-      </w:pPr>
-      <w:r>
-        <w:t>Typescript</w:t>
-      </w:r>
-      <w:r>
-        <w:rPr>
-          <w:spacing w:val="-9"/>
-        </w:rPr>
-        <w:t xml:space="preserve"> </w:t>
-      </w:r>
-      <w:r>
-        <w:t>Tutorial</w:t>
-      </w:r>
-      <w:r>
-        <w:rPr>
-          <w:spacing w:val="-8"/>
-        </w:rPr>
-        <w:t xml:space="preserve"> </w:t>
-      </w:r>
-      <w:r>
-        <w:t>at</w:t>
-      </w:r>
-      <w:r>
-        <w:rPr>
-          <w:spacing w:val="-9"/>
-        </w:rPr>
-        <w:t xml:space="preserve"> </w:t>
-      </w:r>
-      <w:r>
-        <w:t>Programmer</w:t>
-      </w:r>
-      <w:r>
-        <w:rPr>
-          <w:spacing w:val="-8"/>
-        </w:rPr>
-        <w:t xml:space="preserve"> </w:t>
-      </w:r>
-      <w:r>
-        <w:t>Zaman</w:t>
-      </w:r>
-      <w:r>
-        <w:rPr>
-          <w:spacing w:val="-8"/>
-        </w:rPr>
-        <w:t xml:space="preserve"> </w:t>
-      </w:r>
-      <w:r>
-        <w:rPr>
-          <w:spacing w:val="-5"/>
-        </w:rPr>
-        <w:t>Now</w:t>
-      </w:r>
-    </w:p>
-    <w:p>
-      <w:pPr>
-        <w:pStyle w:val="DaftarParagraf"/>
-        <w:numPr>
-          <w:ilvl w:val="1"/>
-          <w:numId w:val="1"/>
-        </w:numPr>
-        <w:tabs>
-          <w:tab w:val="left" w:pos="1079"/>
-        </w:tabs>
-        <w:spacing w:before="2" w:line="240" w:lineRule="exact"/>
-        <w:ind w:left="1079" w:hanging="359"/>
-        <w:rPr>
-          <w:sz w:val="20"/>
-        </w:rPr>
-      </w:pPr>
-      <w:r>
-        <w:rPr>
-          <w:sz w:val="20"/>
-        </w:rPr>
-        <w:t>Typescript</w:t>
-      </w:r>
-      <w:r>
-        <w:rPr>
-          <w:spacing w:val="-10"/>
-          <w:sz w:val="20"/>
-        </w:rPr>
-        <w:t xml:space="preserve"> </w:t>
-      </w:r>
-      <w:r>
-        <w:rPr>
-          <w:spacing w:val="-2"/>
-          <w:sz w:val="20"/>
-        </w:rPr>
-        <w:t>Foundation</w:t>
-      </w:r>
-    </w:p>
-    <w:p>
-      <w:pPr>
-        <w:pStyle w:val="DaftarParagraf"/>
-        <w:numPr>
-          <w:ilvl w:val="1"/>
-          <w:numId w:val="1"/>
-        </w:numPr>
-        <w:tabs>
-          <w:tab w:val="left" w:pos="1079"/>
-        </w:tabs>
-        <w:spacing w:line="235" w:lineRule="exact"/>
-        <w:ind w:left="1079" w:hanging="359"/>
-        <w:rPr>
-          <w:sz w:val="20"/>
-        </w:rPr>
-      </w:pPr>
-      <w:r>
-        <w:rPr>
-          <w:spacing w:val="-5"/>
-          <w:sz w:val="20"/>
-        </w:rPr>
-        <w:t>OOP</w:t>
-      </w:r>
-    </w:p>
-    <w:p>
-      <w:pPr>
-        <w:pStyle w:val="DaftarParagraf"/>
-        <w:numPr>
-          <w:ilvl w:val="1"/>
-          <w:numId w:val="1"/>
-        </w:numPr>
-        <w:tabs>
-          <w:tab w:val="left" w:pos="1079"/>
-        </w:tabs>
-        <w:ind w:left="1079" w:hanging="359"/>
-        <w:rPr>
-          <w:sz w:val="20"/>
-        </w:rPr>
-      </w:pPr>
-      <w:r>
-        <w:rPr>
-          <w:spacing w:val="-2"/>
-          <w:sz w:val="20"/>
-        </w:rPr>
-        <w:t>Generic</w:t>
-      </w:r>
-    </w:p>
-    <w:p>
-      <w:pPr>
-        <w:pStyle w:val="DaftarParagraf"/>
-        <w:numPr>
-          <w:ilvl w:val="1"/>
-          <w:numId w:val="1"/>
-        </w:numPr>
-        <w:tabs>
-          <w:tab w:val="left" w:pos="1079"/>
-        </w:tabs>
-        <w:ind w:left="1079" w:hanging="359"/>
-        <w:rPr>
-          <w:sz w:val="20"/>
-        </w:rPr>
-      </w:pPr>
-      <w:r>
-        <w:rPr>
-          <w:spacing w:val="-2"/>
-          <w:sz w:val="20"/>
-        </w:rPr>
-        <w:t>Validation</w:t>
-      </w:r>
-    </w:p>
-    <w:p>
-      <w:pPr>
-        <w:pStyle w:val="DaftarParagraf"/>
-        <w:numPr>
-          <w:ilvl w:val="1"/>
-          <w:numId w:val="1"/>
-        </w:numPr>
-        <w:tabs>
-          <w:tab w:val="left" w:pos="1079"/>
-        </w:tabs>
-        <w:ind w:left="1079" w:hanging="359"/>
-        <w:rPr>
-          <w:sz w:val="20"/>
-        </w:rPr>
-      </w:pPr>
-      <w:r>
-        <w:rPr>
-          <w:sz w:val="20"/>
-        </w:rPr>
-        <w:t>REST</w:t>
-      </w:r>
-      <w:r>
-        <w:rPr>
-          <w:spacing w:val="-6"/>
-          <w:sz w:val="20"/>
-        </w:rPr>
-        <w:t xml:space="preserve"> </w:t>
-      </w:r>
-      <w:r>
-        <w:rPr>
-          <w:sz w:val="20"/>
-        </w:rPr>
-        <w:t>Full</w:t>
-      </w:r>
-      <w:r>
-        <w:rPr>
-          <w:spacing w:val="-5"/>
-          <w:sz w:val="20"/>
-        </w:rPr>
-        <w:t xml:space="preserve"> API</w:t>
-      </w:r>
-    </w:p>
-    <w:p>
-      <w:pPr>
-        <w:pStyle w:val="TeksIsi"/>
-        <w:spacing w:before="225"/>
-        <w:ind w:left="0" w:firstLine="0"/>
-      </w:pPr>
       <w:r>
         <w:rPr>
           <w:noProof/>
@@ -4625,7 +4823,33 @@
 </file>
 
 <file path=word/numbering.xml><?xml version="1.0" encoding="utf-8"?>
-<w:numbering xmlns:wpc="http://schemas.microsoft.com/office/word/2010/wordprocessingCanvas" xmlns:cx="http://schemas.microsoft.com/office/drawing/2014/chartex" xmlns:cx1="http://schemas.microsoft.com/office/drawing/2015/9/8/chartex" xmlns:cx2="http://schemas.microsoft.com/office/drawing/2015/10/21/chartex" xmlns:cx3="http://schemas.microsoft.com/office/drawing/2016/5/9/chartex" xmlns:cx4="http://schemas.microsoft.com/office/drawing/2016/5/10/chartex" xmlns:cx5="http://schemas.microsoft.com/office/drawing/2016/5/11/chartex" xmlns:cx6="http://schemas.microsoft.com/office/drawing/2016/5/12/chartex" xmlns:cx7="http://schemas.microsoft.com/office/drawing/2016/5/13/chartex" xmlns:cx8="http://schemas.microsoft.com/office/drawing/2016/5/14/chartex" xmlns:mc="http://schemas.openxmlformats.org/markup-compatibility/2006" xmlns:aink="http://schemas.microsoft.com/office/drawing/2016/ink" xmlns:am3d="http://schemas.microsoft.com/office/drawing/2017/model3d" xmlns:o="urn:schemas-microsoft-com:office:office" xmlns:oel="http://schemas.microsoft.com/office/2019/extlst" xmlns:r="http://schemas.openxmlformats.org/officeDocument/2006/relationships" xmlns:m="http://schemas.openxmlformats.org/officeDocument/2006/math" xmlns:v="urn:schemas-microsoft-com:vml" xmlns:wp14="http://schemas.microsoft.com/office/word/2010/wordprocessingDrawing" xmlns:wp="http://schemas.openxmlformats.org/drawingml/2006/wordprocessingDrawing" xmlns:w10="urn:schemas-microsoft-com:office:word" xmlns:w="http://schemas.openxmlformats.org/wordprocessingml/2006/main" xmlns:w14="http://schemas.microsoft.com/office/word/2010/wordml" xmlns:w15="http://schemas.microsoft.com/office/word/2012/wordml" xmlns:w16cex="http://schemas.microsoft.com/office/word/2018/wordml/cex" xmlns:w16cid="http://schemas.microsoft.com/office/word/2016/wordml/cid" xmlns:w16="http://schemas.microsoft.com/office/word/2018/wordml" xmlns:w16du="http://schemas.microsoft.com/office/word/2023/wordml/word16du" xmlns:w16sdtdh="http://schemas.microsoft.com/office/word/2020/wordml/sdtdatahash" xmlns:w16se="http://schemas.microsoft.com/office/word/2015/wordml/symex" xmlns:wpg="http://schemas.microsoft.com/office/word/2010/wordprocessingGroup" xmlns:wpi="http://schemas.microsoft.com/office/word/2010/wordprocessingInk" xmlns:wne="http://schemas.microsoft.com/office/word/2006/wordml" xmlns:wps="http://schemas.microsoft.com/office/word/2010/wordprocessingShape" mc:Ignorable="w14 w15 w16se w16cid w16 w16cex w16sdtdh w16du wp14">
+<w:numbering xmlns:wpc="http://schemas.microsoft.com/office/word/2010/wordprocessingCanvas" xmlns:cx="http://schemas.microsoft.com/office/drawing/2014/chartex" xmlns:cx1="http://schemas.microsoft.com/office/drawing/2015/9/8/chartex" xmlns:cx2="http://schemas.microsoft.com/office/drawing/2015/10/21/chartex" xmlns:cx3="http://schemas.microsoft.com/office/drawing/2016/5/9/chartex" xmlns:cx4="http://schemas.microsoft.com/office/drawing/2016/5/10/chartex" xmlns:cx5="http://schemas.microsoft.com/office/drawing/2016/5/11/chartex" xmlns:cx6="http://schemas.microsoft.com/office/drawing/2016/5/12/chartex" xmlns:cx7="http://schemas.microsoft.com/office/drawing/2016/5/13/chartex" xmlns:cx8="http://schemas.microsoft.com/office/drawing/2016/5/14/chartex" xmlns:mc="http://schemas.openxmlformats.org/markup-compatibility/2006" xmlns:aink="http://schemas.microsoft.com/office/drawing/2016/ink" xmlns:am3d="http://schemas.microsoft.com/office/drawing/2017/model3d" xmlns:o="urn:schemas-microsoft-com:office:office" xmlns:oel="http://schemas.microsoft.com/office/2019/extlst" xmlns:r="http://schemas.openxmlformats.org/officeDocument/2006/relationships" xmlns:m="http://schemas.openxmlformats.org/officeDocument/2006/math" xmlns:v="urn:schemas-microsoft-com:vml" xmlns:wp14="http://schemas.microsoft.com/office/word/2010/wordprocessingDrawing" xmlns:wp="http://schemas.openxmlformats.org/drawingml/2006/wordprocessingDrawing" xmlns:w10="urn:schemas-microsoft-com:office:word" xmlns:w="http://schemas.openxmlformats.org/wordprocessingml/2006/main" xmlns:w14="http://schemas.microsoft.com/office/word/2010/wordml" xmlns:w15="http://schemas.microsoft.com/office/word/2012/wordml" xmlns:w16cex="http://schemas.microsoft.com/office/word/2018/wordml/cex" xmlns:w16cid="http://schemas.microsoft.com/office/word/2016/wordml/cid" xmlns:w16="http://schemas.microsoft.com/office/word/2018/wordml" xmlns:w16du="http://schemas.microsoft.com/office/word/2023/wordml/word16du" xmlns:w16sdtdh="http://schemas.microsoft.com/office/word/2020/wordml/sdtdatahash" xmlns:w16sdtfl="http://schemas.microsoft.com/office/word/2024/wordml/sdtformatlock" xmlns:w16se="http://schemas.microsoft.com/office/word/2015/wordml/symex" xmlns:wpg="http://schemas.microsoft.com/office/word/2010/wordprocessingGroup" xmlns:wpi="http://schemas.microsoft.com/office/word/2010/wordprocessingInk" xmlns:wne="http://schemas.microsoft.com/office/word/2006/wordml" xmlns:wps="http://schemas.microsoft.com/office/word/2010/wordprocessingShape" mc:Ignorable="w14 w15 w16se w16cid w16 w16cex w16sdtdh w16sdtfl w16du wp14">
+  <w:numPicBullet w:numPicBulletId="0">
+    <w:pict>
+      <v:shapetype id="_x0000_t75" coordsize="21600,21600" o:spt="75" o:preferrelative="t" path="m@4@5l@4@11@9@11@9@5xe" filled="f" stroked="f">
+        <v:stroke joinstyle="miter"/>
+        <v:formulas>
+          <v:f eqn="if lineDrawn pixelLineWidth 0"/>
+          <v:f eqn="sum @0 1 0"/>
+          <v:f eqn="sum 0 0 @1"/>
+          <v:f eqn="prod @2 1 2"/>
+          <v:f eqn="prod @3 21600 pixelWidth"/>
+          <v:f eqn="prod @3 21600 pixelHeight"/>
+          <v:f eqn="sum @0 0 1"/>
+          <v:f eqn="prod @6 1 2"/>
+          <v:f eqn="prod @7 21600 pixelWidth"/>
+          <v:f eqn="sum @8 21600 0"/>
+          <v:f eqn="prod @7 21600 pixelHeight"/>
+          <v:f eqn="sum @10 21600 0"/>
+        </v:formulas>
+        <v:path o:extrusionok="f" gradientshapeok="t" o:connecttype="rect"/>
+        <o:lock v:ext="edit" aspectratio="t"/>
+      </v:shapetype>
+      <v:shape id="Gambar 10" o:spid="_x0000_i1025" type="#_x0000_t75" alt="Portfolio Logo PNG Transparent &amp; SVG ..." style="width:112pt;height:112pt;visibility:visible;mso-wrap-style:square" o:bullet="t">
+        <v:imagedata r:id="rId1" o:title="Portfolio Logo PNG Transparent &amp; SVG .."/>
+      </v:shape>
+    </w:pict>
+  </w:numPicBullet>
   <w:abstractNum w:abstractNumId="0" w15:restartNumberingAfterBreak="0">
     <w:nsid w:val="648F1717"/>
     <w:multiLevelType w:val="hybridMultilevel"/>
@@ -4756,7 +4980,7 @@
 </file>
 
 <file path=word/styles.xml><?xml version="1.0" encoding="utf-8"?>
-<w:styles xmlns:mc="http://schemas.openxmlformats.org/markup-compatibility/2006" xmlns:r="http://schemas.openxmlformats.org/officeDocument/2006/relationships" xmlns:w="http://schemas.openxmlformats.org/wordprocessingml/2006/main" xmlns:w14="http://schemas.microsoft.com/office/word/2010/wordml" xmlns:w15="http://schemas.microsoft.com/office/word/2012/wordml" xmlns:w16cex="http://schemas.microsoft.com/office/word/2018/wordml/cex" xmlns:w16cid="http://schemas.microsoft.com/office/word/2016/wordml/cid" xmlns:w16="http://schemas.microsoft.com/office/word/2018/wordml" xmlns:w16du="http://schemas.microsoft.com/office/word/2023/wordml/word16du" xmlns:w16sdtdh="http://schemas.microsoft.com/office/word/2020/wordml/sdtdatahash" xmlns:w16se="http://schemas.microsoft.com/office/word/2015/wordml/symex" mc:Ignorable="w14 w15 w16se w16cid w16 w16cex w16sdtdh w16du">
+<w:styles xmlns:mc="http://schemas.openxmlformats.org/markup-compatibility/2006" xmlns:r="http://schemas.openxmlformats.org/officeDocument/2006/relationships" xmlns:w="http://schemas.openxmlformats.org/wordprocessingml/2006/main" xmlns:w14="http://schemas.microsoft.com/office/word/2010/wordml" xmlns:w15="http://schemas.microsoft.com/office/word/2012/wordml" xmlns:w16cex="http://schemas.microsoft.com/office/word/2018/wordml/cex" xmlns:w16cid="http://schemas.microsoft.com/office/word/2016/wordml/cid" xmlns:w16="http://schemas.microsoft.com/office/word/2018/wordml" xmlns:w16du="http://schemas.microsoft.com/office/word/2023/wordml/word16du" xmlns:w16sdtdh="http://schemas.microsoft.com/office/word/2020/wordml/sdtdatahash" xmlns:w16sdtfl="http://schemas.microsoft.com/office/word/2024/wordml/sdtformatlock" xmlns:w16se="http://schemas.microsoft.com/office/word/2015/wordml/symex" mc:Ignorable="w14 w15 w16se w16cid w16 w16cex w16sdtdh w16sdtfl w16du">
   <w:docDefaults>
     <w:rPrDefault>
       <w:rPr>
@@ -5194,6 +5418,26 @@
       <w:szCs w:val="20"/>
     </w:rPr>
   </w:style>
+  <w:style w:type="paragraph" w:styleId="Judul5">
+    <w:name w:val="heading 5"/>
+    <w:basedOn w:val="Normal"/>
+    <w:next w:val="Normal"/>
+    <w:link w:val="Judul5KAR"/>
+    <w:uiPriority w:val="9"/>
+    <w:unhideWhenUsed/>
+    <w:qFormat/>
+    <w:rsid w:val="00456CA0"/>
+    <w:pPr>
+      <w:keepNext/>
+      <w:keepLines/>
+      <w:spacing w:before="40"/>
+      <w:outlineLvl w:val="4"/>
+    </w:pPr>
+    <w:rPr>
+      <w:rFonts w:asciiTheme="majorHAnsi" w:eastAsiaTheme="majorEastAsia" w:hAnsiTheme="majorHAnsi" w:cstheme="majorBidi"/>
+      <w:color w:val="365F91" w:themeColor="accent1" w:themeShade="BF"/>
+    </w:rPr>
+  </w:style>
   <w:style w:type="character" w:default="1" w:styleId="FontParagrafDefault">
     <w:name w:val="Default Paragraph Font"/>
     <w:uiPriority w:val="1"/>
@@ -5316,6 +5560,17 @@
     <w:rPr>
       <w:color w:val="800080" w:themeColor="followedHyperlink"/>
       <w:u w:val="single"/>
+    </w:rPr>
+  </w:style>
+  <w:style w:type="character" w:customStyle="1" w:styleId="Judul5KAR">
+    <w:name w:val="Judul 5 KAR"/>
+    <w:basedOn w:val="FontParagrafDefault"/>
+    <w:link w:val="Judul5"/>
+    <w:uiPriority w:val="9"/>
+    <w:rsid w:val="00456CA0"/>
+    <w:rPr>
+      <w:rFonts w:asciiTheme="majorHAnsi" w:eastAsiaTheme="majorEastAsia" w:hAnsiTheme="majorHAnsi" w:cstheme="majorBidi"/>
+      <w:color w:val="365F91" w:themeColor="accent1" w:themeShade="BF"/>
     </w:rPr>
   </w:style>
 </w:styles>

</xml_diff>